<commit_message>
feat(hmi): implement HMI dashboard, update manuals and scripts to v4.0
</commit_message>
<xml_diff>
--- a/溫度通報/溫度通報系統操作說明.docx
+++ b/溫度通報/溫度通報系統操作說明.docx
@@ -7,12 +7,12 @@
         <w:pStyle w:val="Heading1"/>
       </w:pPr>
       <w:r>
-        <w:t>彰化縣線西鄉環境溫度監控與通報系統 — 操作與維護說明書 (v3.0)</w:t>
+        <w:t>彰化縣線西鄉環境溫度監控與通報系統 — 操作與維護說明書 (v4.0)</w:t>
       </w:r>
     </w:p>
     <w:p>
       <w:r>
-        <w:t>本系統整合了**本機 Python 排程程式（主要端）**與 **Google Apps Script 雲端腳本（備援端）**，實現 24 小時不間斷的天氣觀測與雙向狀態同步，當溫度高於設定閾值時將發送 LINE 及 Email 通知。</w:t>
+        <w:t>本系統整合了**本機 Python 排程程式（主要端）**與 **Google Apps Script 雲端腳本（備援端與 HMI 門面）**，實現 24 小時不間斷的天氣觀測與雙向狀態同步，當溫度高於設定閾值時將發送 LINE 及 Email 通知。</w:t>
       </w:r>
     </w:p>
     <w:p>
@@ -37,37 +37,43 @@
           <w:rFonts w:ascii="Consolas" w:hAnsi="Consolas"/>
           <w:sz w:val="18"/>
         </w:rPr>
-        <w:t xml:space="preserve">                       ┌─────────────────────────┐</w:t>
+        <w:t xml:space="preserve">                        ┌─────────────────────────┐</w:t>
         <w:br/>
-        <w:t xml:space="preserve">                       │   Google 試算表 (雲端)   │</w:t>
+        <w:t xml:space="preserve">                        │   Google 試算表 (雲端)   │</w:t>
         <w:br/>
-        <w:t xml:space="preserve">                       └────────────┬────────────┘</w:t>
+        <w:t xml:space="preserve">                        └────────────┬────────────┘</w:t>
         <w:br/>
-        <w:t xml:space="preserve">                                    │ (CSV/Apps Script)</w:t>
+        <w:t xml:space="preserve">                                     │ (RPC 通訊 / 試算表讀寫)</w:t>
         <w:br/>
-        <w:t xml:space="preserve">                 ┌──────────────────┴──────────────────┐</w:t>
+        <w:t xml:space="preserve">                  ┌──────────────────┴──────────────────┐</w:t>
         <w:br/>
-        <w:t xml:space="preserve">                 ▼ (本機優先)                          ▼ (備援接管)</w:t>
+        <w:t xml:space="preserve">                  ▼                                     ▼</w:t>
         <w:br/>
-        <w:t xml:space="preserve">      ┌─────────────────────┐               ┌─────────────────────┐</w:t>
+        <w:t xml:space="preserve">       ┌─────────────────────┐               ┌─────────────────────┐</w:t>
         <w:br/>
-        <w:t xml:space="preserve">      │  本機 Python 腳本   │               │   雲端 Apps Script  │</w:t>
+        <w:t xml:space="preserve">       │  本機 Python 腳本   │               │   HMI 人機管理網頁  │</w:t>
         <w:br/>
-        <w:t xml:space="preserve">      │   (每小時定時排程)   │               │   (每小時定時排程)   │</w:t>
+        <w:t xml:space="preserve">       │   (每小時定時排程)   │               │   (Web App 瀏覽器)   │</w:t>
         <w:br/>
-        <w:t xml:space="preserve">      └──────────┬──────────┘               └──────────┬──────────┘</w:t>
+        <w:t xml:space="preserve">       └──────────┬──────────┘               └──────────┬──────────┘</w:t>
         <w:br/>
-        <w:t xml:space="preserve">                 │                                     │</w:t>
+        <w:t xml:space="preserve">                  │ (POST 心跳訊號)                     │ (google.script.run)</w:t>
         <w:br/>
-        <w:t xml:space="preserve">                 ├─► 正常：發送心跳 (Heartbeat)        ├─► 偵測 75 分鐘內有心跳：</w:t>
+        <w:t xml:space="preserve">                  │                                     │</w:t>
         <w:br/>
-        <w:t xml:space="preserve">                 │                                     │   雲端自動跳過不執行</w:t>
+        <w:t xml:space="preserve">                  ▼                                     ▼</w:t>
         <w:br/>
-        <w:t xml:space="preserve">                 │                                     │</w:t>
+        <w:t xml:space="preserve">       ┌─────────────────────────────────────────────────────┐</w:t>
         <w:br/>
-        <w:t xml:space="preserve">                 └─► 斷線/異常：心跳中斷 ──────────────┴─► 逾期無心跳：</w:t>
+        <w:t xml:space="preserve">       │           Google Apps Script 雲端處理中心            │</w:t>
         <w:br/>
-        <w:t xml:space="preserve">                                                           雲端自動接管觀測與通報</w:t>
+        <w:t xml:space="preserve">       │  - doGet(e) ：偵測到瀏覽器請求，輸出 HMI 網頁畫面     │</w:t>
+        <w:br/>
+        <w:t xml:space="preserve">       │  - doPost(e)：接收本機心跳與狀態同步數據            │</w:t>
+        <w:br/>
+        <w:t xml:space="preserve">       │  - 備援排程  ：若本機無心跳，雲端自動接管溫度監測與通知│</w:t>
+        <w:br/>
+        <w:t xml:space="preserve">       └─────────────────────────────────────────────────────┘</w:t>
         <w:br/>
       </w:r>
     </w:p>
@@ -76,7 +82,7 @@
         <w:pStyle w:val="ListNumber"/>
       </w:pPr>
       <w:r>
-        <w:t>**本機主要端**：透過 Windows 工作排程器每小時執行一次，執行時會先與雲端同步警報狀態，並在執行完成後向雲端發送心跳訊號。</w:t>
+        <w:t>**本機主要端**：透過 Windows 工作排程器每小時執行一次，執行時會先與雲端同步警報狀態，並在執行完成後向雲端發送心跳與觀測數據。</w:t>
       </w:r>
     </w:p>
     <w:p>
@@ -84,7 +90,15 @@
         <w:pStyle w:val="ListNumber"/>
       </w:pPr>
       <w:r>
-        <w:t>**雲端備援端**：每小時排程啟動時檢查本機心跳。若本機在 75 分鐘內有活躍紀錄，雲端會自動跳過本次排程；若本機電腦關機或網路中斷（無心跳），雲端將接管觀測並發送通知，並在通報紀錄中註記 `(雲端備援)`。</w:t>
+        <w:t>**雲端備援端**：每小時排程啟動時檢查本機心跳。若本機在指定時間內有活躍紀錄，雲端會自動跳過本次排程；若本機電腦關機或網絡中斷（無心跳），雲端將接管觀測並發送通知，並在通報紀錄中註記 `(雲端備援)`。</w:t>
+      </w:r>
+    </w:p>
+    <w:p>
+      <w:pPr>
+        <w:pStyle w:val="ListNumber"/>
+      </w:pPr>
+      <w:r>
+        <w:t>**雲端人機端 (HMI)**：當人員開啟 Web App 網址時，會顯示響應式的深色科技風人機網頁，不需進入試算表即可修改閾值/時段、管理聯絡人並查詢與匯出歷史溫度紀錄。</w:t>
       </w:r>
     </w:p>
     <w:p>
@@ -93,11 +107,6 @@
       </w:pPr>
       <w:r>
         <w:t>📊 觀測溫度數據來源</w:t>
-      </w:r>
-    </w:p>
-    <w:p>
-      <w:r>
-        <w:t>本系統的即時環境溫度數據來自官方氣象局觀測資料：</w:t>
       </w:r>
     </w:p>
     <w:p>
@@ -113,7 +122,7 @@
         <w:pStyle w:val="ListBullet"/>
       </w:pPr>
       <w:r>
-        <w:t>**抓取站點**：彰化縣伸港鄉「伸港觀測站」（站點編號：`C2G870`）。</w:t>
+        <w:t>**抓取站點**：彰化縣伸港鄉「伸港觀測站」（站點編號：`C2G870`），提供 10 分鐘即時更新。</w:t>
       </w:r>
     </w:p>
     <w:p>
@@ -121,7 +130,33 @@
         <w:pStyle w:val="ListBullet"/>
       </w:pPr>
       <w:r>
-        <w:t>*測站變更說明*：本廠區雖位於線西鄉，但因線西自動氣象站（`C0G900`）在官方系統中僅提供「每小時整點」資料，且發布有 15~20 分鐘延遲，導致整點初執行時只能獲取上個整點資料（例如 09:05 執行時拿到 08:00 資料，落後一小時）。為了獲取更即時的監控，本系統自 v3.2 起改為對接鄰近且支援 **每 10 分鐘更新一次** 的「伸港觀測站」，使資料延遲大幅縮短。</w:t>
+        <w:t>**抓取指標**：即時環境溫度/乾球溫度（即氣象署 API 中的 `AirTemperature` 欄位）。</w:t>
+      </w:r>
+    </w:p>
+    <w:p>
+      <w:r>
+        <w:t>---</w:t>
+      </w:r>
+    </w:p>
+    <w:p>
+      <w:pPr>
+        <w:pStyle w:val="Heading2"/>
+      </w:pPr>
+      <w:r>
+        <w:t>🖥️ HMI 人機介面操作指南</w:t>
+      </w:r>
+    </w:p>
+    <w:p>
+      <w:r>
+        <w:t>管理人員不需直接開啟 Google 試算表。只需在瀏覽器（支援手機與電腦）開啟部署所取得的 **Web App 網址**，即可進行所有日常維護：</w:t>
+      </w:r>
+    </w:p>
+    <w:p>
+      <w:pPr>
+        <w:pStyle w:val="Heading3"/>
+      </w:pPr>
+      <w:r>
+        <w:t>1. 📊 狀態儀表板 (Dashboard)</w:t>
       </w:r>
     </w:p>
     <w:p>
@@ -129,7 +164,135 @@
         <w:pStyle w:val="ListBullet"/>
       </w:pPr>
       <w:r>
-        <w:t>**抓取指標**：即時的「一般環境溫度/乾球溫度」（即氣象署 API 資料中的 `AirTemperature` 欄位）。</w:t>
+        <w:t>**即時氣溫圓形儀表 (Gauge)**：大字顯示伸港測站最新溫度，顏色會依據氣溫自動轉變（正常：綠色、接近閾值：黃色、超標：紅色呼吸發光）。</w:t>
+      </w:r>
+    </w:p>
+    <w:p>
+      <w:pPr>
+        <w:pStyle w:val="ListBullet"/>
+      </w:pPr>
+      <w:r>
+        <w:t>**氣象發布時間**：顯示中央氣象署最新氣溫發布的時間。</w:t>
+      </w:r>
+    </w:p>
+    <w:p>
+      <w:pPr>
+        <w:pStyle w:val="ListBullet"/>
+      </w:pPr>
+      <w:r>
+        <w:t>**本機心跳狀態**：顯示本機 Python 程式最後執行時間與「在線/離線狀態」。若狀態顯示「離線警報」，代表本機可能中斷或斷網，此時雲端將自動接管通報任務。</w:t>
+      </w:r>
+    </w:p>
+    <w:p>
+      <w:pPr>
+        <w:pStyle w:val="ListBullet"/>
+      </w:pPr>
+      <w:r>
+        <w:t>**快速工具**：提供三個一鍵測試按鈕（強制測試發送 LINE/信件、清除重複通報鎖定、重設紀錄分頁欄寬）。</w:t>
+      </w:r>
+    </w:p>
+    <w:p>
+      <w:pPr>
+        <w:pStyle w:val="Heading3"/>
+      </w:pPr>
+      <w:r>
+        <w:t>2. ⚙️ 系統設定管理 (Settings)</w:t>
+      </w:r>
+    </w:p>
+    <w:p>
+      <w:pPr>
+        <w:pStyle w:val="ListBullet"/>
+      </w:pPr>
+      <w:r>
+        <w:t>**溫度警報閾值設定**：拖曳拉桿調整閾值，支援小數點（如 `28.5`°C）。</w:t>
+      </w:r>
+    </w:p>
+    <w:p>
+      <w:pPr>
+        <w:pStyle w:val="ListBullet"/>
+      </w:pPr>
+      <w:r>
+        <w:t>**監測時段設定**：選擇開始與結束小時，自動支援跨夜（如開始 22 點、結束 6 點）。</w:t>
+      </w:r>
+    </w:p>
+    <w:p>
+      <w:pPr>
+        <w:pStyle w:val="ListBullet"/>
+      </w:pPr>
+      <w:r>
+        <w:t>**檢查頻率調整**：可調整雲端定時檢查的頻率（10, 15, 30, 60 分鐘）。</w:t>
+      </w:r>
+    </w:p>
+    <w:p>
+      <w:pPr>
+        <w:pStyle w:val="ListBullet"/>
+      </w:pPr>
+      <w:r>
+        <w:t>**儲存設定**：點擊儲存後，雲端試算表設定檔將同步更新，Apps Script 定時排程亦會自動重建，無須手動配置。</w:t>
+      </w:r>
+    </w:p>
+    <w:p>
+      <w:pPr>
+        <w:pStyle w:val="Heading3"/>
+      </w:pPr>
+      <w:r>
+        <w:t>3. 👥 聯絡人名冊 (Contacts)</w:t>
+      </w:r>
+    </w:p>
+    <w:p>
+      <w:pPr>
+        <w:pStyle w:val="ListBullet"/>
+      </w:pPr>
+      <w:r>
+        <w:t>**快速切換啟用開關**：直接點選表格中的開關（Toggle Switch）即可立即「啟用」或「停用」某聯絡人，系統會即時存檔。</w:t>
+      </w:r>
+    </w:p>
+    <w:p>
+      <w:pPr>
+        <w:pStyle w:val="ListBullet"/>
+      </w:pPr>
+      <w:r>
+        <w:t>**新增聯絡人**：點選右上角「新增聯絡收件人」開啟表單，輸入姓名、Email 與 LINE ID。LINE ID 必須以大寫 U (個人)、C (群組) 或 R (聊天室) 開頭。</w:t>
+      </w:r>
+    </w:p>
+    <w:p>
+      <w:pPr>
+        <w:pStyle w:val="ListBullet"/>
+      </w:pPr>
+      <w:r>
+        <w:t>**刪除聯絡人**：點擊每列後方的紅色垃圾桶圖示並確認即可移除。</w:t>
+      </w:r>
+    </w:p>
+    <w:p>
+      <w:pPr>
+        <w:pStyle w:val="Heading3"/>
+      </w:pPr>
+      <w:r>
+        <w:t>4. 📜 歷史通報紀錄 (History Logs)</w:t>
+      </w:r>
+    </w:p>
+    <w:p>
+      <w:pPr>
+        <w:pStyle w:val="ListBullet"/>
+      </w:pPr>
+      <w:r>
+        <w:t>**紀錄表格**：顯示當月份 `紀錄_YYYY-MM` 分頁中最新 100 筆數據。</w:t>
+      </w:r>
+    </w:p>
+    <w:p>
+      <w:pPr>
+        <w:pStyle w:val="ListBullet"/>
+      </w:pPr>
+      <w:r>
+        <w:t>**篩選與搜尋**：在搜尋框輸入關鍵字（例如時間、超標、LINE、備援、心跳），即可即時過濾表格內容。</w:t>
+      </w:r>
+    </w:p>
+    <w:p>
+      <w:pPr>
+        <w:pStyle w:val="ListBullet"/>
+      </w:pPr>
+      <w:r>
+        <w:t>**匯出本頁 CSV**：點擊「匯出本頁 CSV」一鍵將篩選後的紀錄下載為 CSV 格式檔案，方便後續稽核與分析。</w:t>
       </w:r>
     </w:p>
     <w:p>
@@ -252,14 +415,6 @@
         <w:pStyle w:val="ListNumber"/>
       </w:pPr>
       <w:r>
-        <w:t>觸發程序選擇 **「每天」**，並設定間隔時間。</w:t>
-      </w:r>
-    </w:p>
-    <w:p>
-      <w:pPr>
-        <w:pStyle w:val="ListNumber"/>
-      </w:pPr>
-      <w:r>
         <w:t>動作選擇 **「啟動程式」**：</w:t>
       </w:r>
     </w:p>
@@ -268,7 +423,7 @@
         <w:pStyle w:val="ListBullet"/>
       </w:pPr>
       <w:r>
-        <w:t>**程式或指令碼**：填入您的 python 執行路徑（例如 `python` 或 `C:\Users\...\AppData\Local\Programs\Python\Python310\python.exe`）。</w:t>
+        <w:t>**程式或指令碼**：填入您的 python 執行路徑（例如 `python`）。</w:t>
       </w:r>
     </w:p>
     <w:p>
@@ -284,7 +439,7 @@
         <w:pStyle w:val="ListBullet"/>
       </w:pPr>
       <w:r>
-        <w:t>**開始位置**：`C:\GOOGLE ANGET\溫度通報`</w:t>
+        <w:t>**開始位置**：`d:\GOOGLE ANGET\溫度通報` (請依據您的實際目錄修改)</w:t>
       </w:r>
     </w:p>
     <w:p>
@@ -293,6 +448,14 @@
       </w:pPr>
       <w:r>
         <w:t>在建立後，對工作按右鍵 -&gt; **「內容」**，可於「觸發程序」頁面點選編輯，並勾選「重複工作間隔」為 **「1 小時」**，持續時間為「無限期」，以達到每小時自動執行的效果。</w:t>
+      </w:r>
+    </w:p>
+    <w:p>
+      <w:pPr>
+        <w:pStyle w:val="ListNumber"/>
+      </w:pPr>
+      <w:r>
+        <w:t>*本機排程自動節流*：本機程式會自動讀取 HMI 網頁中設定的「監測頻率」，若檢查間隔時間未到，程式會自動靜默結束，因此本機排程可以設定得比監測頻率更頻繁，系統會自行處理節流。</w:t>
       </w:r>
     </w:p>
     <w:p>
@@ -305,7 +468,7 @@
         <w:pStyle w:val="Heading2"/>
       </w:pPr>
       <w:r>
-        <w:t>☁️ 雲端備援與同步設定</w:t>
+        <w:t>🕹️ 雲端後台管理與進階維護</w:t>
       </w:r>
     </w:p>
     <w:p>
@@ -313,31 +476,44 @@
         <w:pStyle w:val="Heading3"/>
       </w:pPr>
       <w:r>
-        <w:t>1. 貼上 Apps Script 程式碼</w:t>
+        <w:t>1. 雲端試算表設定 (備用降級機制)</w:t>
+      </w:r>
+    </w:p>
+    <w:p>
+      <w:r>
+        <w:t>如果因瀏覽器相容性等極端原因無法開啟 HMI 網頁，您仍然可以直接在 Google 試算表中進行管理：</w:t>
       </w:r>
     </w:p>
     <w:p>
       <w:pPr>
-        <w:pStyle w:val="ListNumber"/>
+        <w:pStyle w:val="ListBullet"/>
       </w:pPr>
       <w:r>
-        <w:t>開啟您的 Google 試算表。</w:t>
+        <w:t>**`系統設定` 工作表**：包含閾值、監測開始與結束整點、頻率。修改此分頁後，必須點選試算表上方選單 **`🌡️ 溫度通報系統` -&gt; `⚙️ 套用設定並更新排程`** 才能生效。</w:t>
       </w:r>
     </w:p>
     <w:p>
       <w:pPr>
-        <w:pStyle w:val="ListNumber"/>
+        <w:pStyle w:val="ListBullet"/>
       </w:pPr>
       <w:r>
-        <w:t>點選 **「擴充功能」 -&gt; 「Apps Script」**。</w:t>
+        <w:t>**第一工作表 (聯絡人)**：包含姓名、Email、LINE_ID、Enabled（填寫 `N` 或 `No` 代表停用）。</w:t>
       </w:r>
     </w:p>
     <w:p>
       <w:pPr>
-        <w:pStyle w:val="ListNumber"/>
+        <w:pStyle w:val="ListBullet"/>
       </w:pPr>
       <w:r>
-        <w:t>清空編輯器後貼上 `複製雲端代碼.py` 內提供的代碼並點選儲存。</w:t>
+        <w:t>**`紀錄_YYYY-MM` 工作表**：存放每月通報紀錄與心跳狀態。</w:t>
+      </w:r>
+    </w:p>
+    <w:p>
+      <w:pPr>
+        <w:pStyle w:val="ListBullet"/>
+      </w:pPr>
+      <w:r>
+        <w:t>表頭欄位：`["通報時間", "溫度閾值設定 (°C)", "通報環境溫度 (°C)", "氣象觀測時間", "警報狀態", "通知狀態"]`</w:t>
       </w:r>
     </w:p>
     <w:p>
@@ -345,406 +521,12 @@
         <w:pStyle w:val="Heading3"/>
       </w:pPr>
       <w:r>
-        <w:t>2. 部署為 Web App 網頁應用程式 (本機心跳同步必備)</w:t>
-      </w:r>
-    </w:p>
-    <w:p>
-      <w:pPr>
-        <w:pStyle w:val="ListNumber"/>
-      </w:pPr>
-      <w:r>
-        <w:t>點選 Apps Script 頁面右上角 **「部署 (Deploy)」 -&gt; 「新建部署 (New deployment)」**。</w:t>
-      </w:r>
-    </w:p>
-    <w:p>
-      <w:pPr>
-        <w:pStyle w:val="ListNumber"/>
-      </w:pPr>
-      <w:r>
-        <w:t>點選左上角齒輪圖示，選取 **「網頁應用程式 (Web App)」**。</w:t>
-      </w:r>
-    </w:p>
-    <w:p>
-      <w:pPr>
-        <w:pStyle w:val="ListNumber"/>
-      </w:pPr>
-      <w:r>
-        <w:t>進行設定：</w:t>
-      </w:r>
-    </w:p>
-    <w:p>
-      <w:pPr>
-        <w:pStyle w:val="ListBullet"/>
-      </w:pPr>
-      <w:r>
-        <w:t>**專案說明**：填入 `溫度通報同步端`。</w:t>
-      </w:r>
-    </w:p>
-    <w:p>
-      <w:pPr>
-        <w:pStyle w:val="ListBullet"/>
-      </w:pPr>
-      <w:r>
-        <w:t>**將網頁應用程式執行為**：選擇 **「我 (您的帳戶)」**。</w:t>
-      </w:r>
-    </w:p>
-    <w:p>
-      <w:pPr>
-        <w:pStyle w:val="ListBullet"/>
-      </w:pPr>
-      <w:r>
-        <w:t>**誰可以存取**：選擇 **「所有人 (Anyone)」**（必須是 Anyone，否則本機 Python 無權限傳送心跳）。</w:t>
-      </w:r>
-    </w:p>
-    <w:p>
-      <w:pPr>
-        <w:pStyle w:val="ListNumber"/>
-      </w:pPr>
-      <w:r>
-        <w:t>點選部署，並複製產生的 **網頁應用程式網址 (Web App URL)**，將此網址貼入本機 `config.json` 內的 `"web_app_url"` 欄位中。</w:t>
-      </w:r>
-    </w:p>
-    <w:p>
-      <w:pPr>
-        <w:pStyle w:val="Heading3"/>
-      </w:pPr>
-      <w:r>
-        <w:t>3. 設定每小時自動排程</w:t>
-      </w:r>
-    </w:p>
-    <w:p>
-      <w:pPr>
-        <w:pStyle w:val="ListNumber"/>
-      </w:pPr>
-      <w:r>
-        <w:t>在 Apps Script 左側選單點擊 **「觸發條件 (Triggers)」**（時鐘圖示）。</w:t>
-      </w:r>
-    </w:p>
-    <w:p>
-      <w:pPr>
-        <w:pStyle w:val="ListNumber"/>
-      </w:pPr>
-      <w:r>
-        <w:t>點選右下角 **「新增觸發條件」**。</w:t>
-      </w:r>
-    </w:p>
-    <w:p>
-      <w:pPr>
-        <w:pStyle w:val="ListNumber"/>
-      </w:pPr>
-      <w:r>
-        <w:t>設定：</w:t>
-      </w:r>
-    </w:p>
-    <w:p>
-      <w:pPr>
-        <w:pStyle w:val="ListBullet"/>
-      </w:pPr>
-      <w:r>
-        <w:t>選擇要執行的功能：`checkWeatherAndNotify`</w:t>
-      </w:r>
-    </w:p>
-    <w:p>
-      <w:pPr>
-        <w:pStyle w:val="ListBullet"/>
-      </w:pPr>
-      <w:r>
-        <w:t>選擇應執行的部署作業：`主要 (Head)`</w:t>
-      </w:r>
-    </w:p>
-    <w:p>
-      <w:pPr>
-        <w:pStyle w:val="ListBullet"/>
-      </w:pPr>
-      <w:r>
-        <w:t>選取活動來源：`時間驅動 (Time-driven)`</w:t>
-      </w:r>
-    </w:p>
-    <w:p>
-      <w:pPr>
-        <w:pStyle w:val="ListBullet"/>
-      </w:pPr>
-      <w:r>
-        <w:t>選取時間型觸發條件類型：`小時定時器 (Hour timer)`</w:t>
-      </w:r>
-    </w:p>
-    <w:p>
-      <w:pPr>
-        <w:pStyle w:val="ListBullet"/>
-      </w:pPr>
-      <w:r>
-        <w:t>選取間隔時間：`每小時 (Every hour)`</w:t>
-      </w:r>
-    </w:p>
-    <w:p>
-      <w:pPr>
-        <w:pStyle w:val="ListNumber"/>
-      </w:pPr>
-      <w:r>
-        <w:t>點選儲存，並完成權限允許審查。</w:t>
+        <w:t>2. LINE 自動查詢 ID 功能 (LINE Bot 專屬)</w:t>
       </w:r>
     </w:p>
     <w:p>
       <w:r>
-        <w:t>---</w:t>
-      </w:r>
-    </w:p>
-    <w:p>
-      <w:pPr>
-        <w:pStyle w:val="Heading2"/>
-      </w:pPr>
-      <w:r>
-        <w:t>🕹️ 日常維護與操作手冊</w:t>
-      </w:r>
-    </w:p>
-    <w:p>
-      <w:pPr>
-        <w:pStyle w:val="Heading3"/>
-      </w:pPr>
-      <w:r>
-        <w:t>1. 免進程式碼 — 試算表自訂功能</w:t>
-      </w:r>
-    </w:p>
-    <w:p>
-      <w:r>
-        <w:t>#### 方法 A：使用試算表頂端選單</w:t>
-      </w:r>
-    </w:p>
-    <w:p>
-      <w:r>
-        <w:t>貼上新代碼並儲存後，重新整理試算表頁面，頂端選單列會多出 **`🌡️ 溫度通報系統`**，內含三個一鍵式操作：</w:t>
-      </w:r>
-    </w:p>
-    <w:p>
-      <w:pPr>
-        <w:pStyle w:val="ListNumber"/>
-      </w:pPr>
-      <w:r>
-        <w:t>**`🧪 測試即時通報 (強制發送)`**：一鍵強制發送當前彰化縣線西鄉的環境溫度警報，會直接繞過 08:00 - 24:00 與重複通知狀態鎖定，完成後會顯示提示視窗。</w:t>
-      </w:r>
-    </w:p>
-    <w:p>
-      <w:pPr>
-        <w:pStyle w:val="ListNumber"/>
-      </w:pPr>
-      <w:r>
-        <w:t>**`🔄 重置防重複鎖定`**：清除目前的重複通知限制。若溫度仍超標，下一個整點排程將會再次通報。</w:t>
-      </w:r>
-    </w:p>
-    <w:p>
-      <w:pPr>
-        <w:pStyle w:val="ListNumber"/>
-      </w:pPr>
-      <w:r>
-        <w:t>**`📏 重設欄寬為最佳預設`**：一鍵將當前月份紀錄分頁（如 `紀錄_2026-06`）的欄位寬度調整為最美觀的預設比例。</w:t>
-      </w:r>
-    </w:p>
-    <w:p>
-      <w:r>
-        <w:t>#### 方法 B：使用試算表內按鈕</w:t>
-      </w:r>
-    </w:p>
-    <w:p>
-      <w:pPr>
-        <w:pStyle w:val="ListNumber"/>
-      </w:pPr>
-      <w:r>
-        <w:t>在工作表中點選 **「插入」 -&gt; 「繪圖」**，畫一個按鈕並寫上文字（如 `測試通報`），儲存。</w:t>
-      </w:r>
-    </w:p>
-    <w:p>
-      <w:pPr>
-        <w:pStyle w:val="ListNumber"/>
-      </w:pPr>
-      <w:r>
-        <w:t>右鍵點選該按鈕圖示 -&gt; 點擊右上角 **「三個點」 -&gt; 「指派指令碼」**，輸入以下指令碼名稱（不加括弧）：</w:t>
-      </w:r>
-    </w:p>
-    <w:p>
-      <w:pPr>
-        <w:pStyle w:val="ListBullet"/>
-      </w:pPr>
-      <w:r>
-        <w:t>**測試通報按鈕** 指派為：`testNotifyForce`</w:t>
-      </w:r>
-    </w:p>
-    <w:p>
-      <w:pPr>
-        <w:pStyle w:val="ListBullet"/>
-      </w:pPr>
-      <w:r>
-        <w:t>**重置鎖定按鈕** 指派為：`clearNotifiedState`</w:t>
-      </w:r>
-    </w:p>
-    <w:p>
-      <w:pPr>
-        <w:pStyle w:val="ListBullet"/>
-      </w:pPr>
-      <w:r>
-        <w:t>**重設欄寬按鈕** 指派為：`resetColumnWidths`</w:t>
-      </w:r>
-    </w:p>
-    <w:p>
-      <w:pPr>
-        <w:pStyle w:val="ListNumber"/>
-      </w:pPr>
-      <w:r>
-        <w:t>任何人員直接在工作表中點擊按鈕即可立即觸發執行。</w:t>
-      </w:r>
-    </w:p>
-    <w:p>
-      <w:pPr>
-        <w:pStyle w:val="Heading3"/>
-      </w:pPr>
-      <w:r>
-        <w:t>2. 人員名單與系統設定變更</w:t>
-      </w:r>
-    </w:p>
-    <w:p>
-      <w:r>
-        <w:t>#### A. 系統設定 (溫度閥值、監測時段與頻率)</w:t>
-      </w:r>
-    </w:p>
-    <w:p>
-      <w:r>
-        <w:t>本系統自 v3.4 起，將所有設定參數集中在獨立的 **`系統設定`** 分頁中進行管理。當試算表開啟或雲端執行時，若該分頁不存在，系統會**自動建立**預設設定分頁。</w:t>
-      </w:r>
-    </w:p>
-    <w:p>
-      <w:r>
-        <w:t>您可以直接修改該分頁中的值：</w:t>
-      </w:r>
-    </w:p>
-    <w:p>
-      <w:pPr>
-        <w:pStyle w:val="ListBullet"/>
-      </w:pPr>
-      <w:r>
-        <w:t>**溫度警報閾值 (°C)**：當環境溫度高於此溫度時發送高溫警報，回落低於此值時發送解除警報（例如預設設為 `28.0`）。</w:t>
-      </w:r>
-    </w:p>
-    <w:p>
-      <w:pPr>
-        <w:pStyle w:val="ListBullet"/>
-      </w:pPr>
-      <w:r>
-        <w:t>**監測開始時間 (點)**：每日開始監測的整點小時（例如 `8` 代表 08:00，支援 0-23）。</w:t>
-      </w:r>
-    </w:p>
-    <w:p>
-      <w:pPr>
-        <w:pStyle w:val="ListBullet"/>
-      </w:pPr>
-      <w:r>
-        <w:t>**監測結束時間 (點)**：每日結束監測的整點小時（例如 `24` 代表 24:00，支援 0-23）。</w:t>
-      </w:r>
-    </w:p>
-    <w:p>
-      <w:pPr>
-        <w:pStyle w:val="ListBullet"/>
-      </w:pPr>
-      <w:r>
-        <w:t>*跨夜監測支援*：若開始時間大於或等於結束時間（例如開始 `22`、結束 `6`），系統會自動判定為跨夜時段，於每天 22:00 到隔天 06:00 進行監測。</w:t>
-      </w:r>
-    </w:p>
-    <w:p>
-      <w:pPr>
-        <w:pStyle w:val="ListBullet"/>
-      </w:pPr>
-      <w:r>
-        <w:t>**監測頻率 (分鐘)**：環境溫度檢查的執行頻率。支援設定為 `10`、`15`、`30`、`60` 等分鐘數。</w:t>
-      </w:r>
-    </w:p>
-    <w:p>
-      <w:pPr>
-        <w:pStyle w:val="ListBullet"/>
-      </w:pPr>
-      <w:r>
-        <w:t>*雲端排程自動更新*：修改頻率後，請點選試算表頂端選單 **`🌡️ 溫度通報系統` -&gt; `⚙️ 套用設定並更新排程`**，雲端排程將自動在背景重新設定為新頻率，無須進入 Apps Script 手動配置！</w:t>
-      </w:r>
-    </w:p>
-    <w:p>
-      <w:pPr>
-        <w:pStyle w:val="ListBullet"/>
-      </w:pPr>
-      <w:r>
-        <w:t>*本機排程自動節流*：本機 Windows 工作排程器建議設定為每 10 分鐘或 5 分鐘固定執行一次。Python 程式會自動讀取此處的「監測頻率」，若檢查間隔時間未到，程式會自動靜默結束，完全不需要手動調整 Windows 排程器！</w:t>
-      </w:r>
-    </w:p>
-    <w:p>
-      <w:r>
-        <w:t>#### B. 聯絡人名單變更 (新增/停用人員)</w:t>
-      </w:r>
-    </w:p>
-    <w:p>
-      <w:r>
-        <w:t>在第一個工作表分頁中，您可以自由新增、刪除或暫停人員，版面乾淨清晰，表頭不會再與設定欄位混雜：</w:t>
-      </w:r>
-    </w:p>
-    <w:p>
-      <w:pPr>
-        <w:pStyle w:val="ListBullet"/>
-      </w:pPr>
-      <w:r>
-        <w:t>**新增聯絡人**：直接新增一列，填寫姓名 `Name`、`Email` 與 `LINE_ID`（個人 ID 必須以大寫 `U` 開頭）。</w:t>
-      </w:r>
-    </w:p>
-    <w:p>
-      <w:pPr>
-        <w:pStyle w:val="ListBullet"/>
-      </w:pPr>
-      <w:r>
-        <w:t>**暫停通報**：若要暫時停止對某人通報，只需在其該列的 `Enabled` 欄位填寫 **`N`**（或 `No`、`False`）即可。</w:t>
-      </w:r>
-    </w:p>
-    <w:p>
-      <w:pPr>
-        <w:pStyle w:val="Heading3"/>
-      </w:pPr>
-      <w:r>
-        <w:t>3. LINE 自動查詢 ID 功能 (LINE Bot 專屬)</w:t>
-      </w:r>
-    </w:p>
-    <w:p>
-      <w:r>
-        <w:t>當有新群組或個人加入時，只需在 LINE 聊天室中傳送關鍵字：`id` 或 `查詢id`，LINE 機器人會透過 Webhook 自動將該對象的 `LINE_ID` 寫入試算表第一個分頁的最下方，管理人員可直接複製該 ID 填入聯絡人清單中。</w:t>
-      </w:r>
-    </w:p>
-    <w:p>
-      <w:pPr>
-        <w:pStyle w:val="Heading3"/>
-      </w:pPr>
-      <w:r>
-        <w:t>4. 歷史紀錄查詢與持續監測功能</w:t>
-      </w:r>
-    </w:p>
-    <w:p>
-      <w:r>
-        <w:t>不論是否發送通報（氣溫正常或重複狀態），系統每小時執行皆會將觀測到的溫度寫入紀錄，便於人員後續追查數據。系統會自動在試算表新建或寫入名為 **`紀錄_YYYY-MM`** 的月份分頁（如 `紀錄_2026-06`），記錄以下明細：</w:t>
-      </w:r>
-    </w:p>
-    <w:p>
-      <w:pPr>
-        <w:pStyle w:val="ListBullet"/>
-      </w:pPr>
-      <w:r>
-        <w:t>**通報時間**、**溫度閾值設定**、**通報環境溫度**、**氣象觀測時間**、**警報狀態**、**通知狀態**。</w:t>
-      </w:r>
-    </w:p>
-    <w:p>
-      <w:pPr>
-        <w:pStyle w:val="ListBullet"/>
-      </w:pPr>
-      <w:r>
-        <w:t>若通知狀態後面有標註 `(雲端備援)`，即代表當時由雲端伺服器排程執行寫入。</w:t>
-      </w:r>
-    </w:p>
-    <w:p>
-      <w:pPr>
-        <w:pStyle w:val="ListBullet"/>
-      </w:pPr>
-      <w:r>
-        <w:t>若通知狀態後面有標註 `(本機心跳)` 或 `(本機心跳 - 心跳)`，即代表當時由本機排程執行，並透過心跳 Webhook 自動回傳數據寫入試算表。</w:t>
+        <w:t>當有新群組或個人加入時，只需在 LINE 聊天室中傳送關鍵字：`id` 或 `查詢id`，LINE 機器人會透過 Webhook 自動將該對象的 `LINE_ID` 寫入試算表第一個分頁的最下方，管理人員可直接複製該 ID 填入 HMI 聯絡人管理介面中。</w:t>
       </w:r>
     </w:p>
     <w:sectPr>

</xml_diff>

<commit_message>
feat(hmi): release HMI v4.1 with mobile layout adaptions and password security
</commit_message>
<xml_diff>
--- a/溫度通報/溫度通報系統操作說明.docx
+++ b/溫度通報/溫度通報系統操作說明.docx
@@ -7,7 +7,7 @@
         <w:pStyle w:val="Heading1"/>
       </w:pPr>
       <w:r>
-        <w:t>彰化縣線西鄉環境溫度監控與通報系統 — 操作與維護說明書 (v4.0)</w:t>
+        <w:t>彰化縣線西鄉環境溫度監控與通報系統 — 操作與維護說明書 (v4.1)</w:t>
       </w:r>
     </w:p>
     <w:p>
@@ -143,12 +143,68 @@
         <w:pStyle w:val="Heading2"/>
       </w:pPr>
       <w:r>
-        <w:t>🖥️ HMI 人機介面操作指南</w:t>
+        <w:t>🖥️ HMI 人機介面操作指南 (已針對手機端與密碼保護優化)</w:t>
       </w:r>
     </w:p>
     <w:p>
       <w:r>
         <w:t>管理人員不需直接開啟 Google 試算表。只需在瀏覽器（支援手機與電腦）開啟部署所取得的 **Web App 網址**，即可進行所有日常維護：</w:t>
+      </w:r>
+    </w:p>
+    <w:p>
+      <w:pPr>
+        <w:pStyle w:val="Heading3"/>
+      </w:pPr>
+      <w:r>
+        <w:t>🔑 安全防護與登出</w:t>
+      </w:r>
+    </w:p>
+    <w:p>
+      <w:pPr>
+        <w:pStyle w:val="ListBullet"/>
+      </w:pPr>
+      <w:r>
+        <w:t>**身份驗證**：進入「系統設定」、「聯絡人名冊」或點擊測試按鈕時，系統會要求輸入管理密碼。預設密碼為 **`admin888`**。</w:t>
+      </w:r>
+    </w:p>
+    <w:p>
+      <w:pPr>
+        <w:pStyle w:val="ListBullet"/>
+      </w:pPr>
+      <w:r>
+        <w:t>**解鎖工作**：成功解鎖後即可進入操作，並且會在瀏覽器階段快取（Session）中保存登入狀態。</w:t>
+      </w:r>
+    </w:p>
+    <w:p>
+      <w:pPr>
+        <w:pStyle w:val="ListBullet"/>
+      </w:pPr>
+      <w:r>
+        <w:t>**安全登出**：點擊網頁右上角（或側邊欄最下方）的「登出」按鈕，即可清除快取狀態，重新鎖定網頁，防止其他人操作。</w:t>
+      </w:r>
+    </w:p>
+    <w:p>
+      <w:pPr>
+        <w:pStyle w:val="Heading3"/>
+      </w:pPr>
+      <w:r>
+        <w:t>📱 手機介面特別優化</w:t>
+      </w:r>
+    </w:p>
+    <w:p>
+      <w:pPr>
+        <w:pStyle w:val="ListBullet"/>
+      </w:pPr>
+      <w:r>
+        <w:t>**底部導覽列**：使用手機存取時，系統會將左側選單優化為底部懸浮導覽列，符合行動單手操作。</w:t>
+      </w:r>
+    </w:p>
+    <w:p>
+      <w:pPr>
+        <w:pStyle w:val="ListBullet"/>
+      </w:pPr>
+      <w:r>
+        <w:t>**Swipe 表格滑動**：表格欄位支援手勢橫向滑動，避免資料擠壓變形，方便在小螢幕查看 LINE ID 與 Email。</w:t>
       </w:r>
     </w:p>
     <w:p>
@@ -196,7 +252,7 @@
         <w:pStyle w:val="Heading3"/>
       </w:pPr>
       <w:r>
-        <w:t>2. ⚙️ 系統設定管理 (Settings)</w:t>
+        <w:t>2. ⚙️ 系統設定管理 (Settings) (需密碼解鎖)</w:t>
       </w:r>
     </w:p>
     <w:p>
@@ -228,7 +284,15 @@
         <w:pStyle w:val="ListBullet"/>
       </w:pPr>
       <w:r>
-        <w:t>**儲存設定**：點擊儲存後，雲端試算表設定檔將同步更新，Apps Script 定時排程亦會自動重建，無須手動配置。</w:t>
+        <w:t>**密碼更改功能**：可在「管理網頁密碼」欄位填入新密碼以進行修改（不修改請留空）。</w:t>
+      </w:r>
+    </w:p>
+    <w:p>
+      <w:pPr>
+        <w:pStyle w:val="ListBullet"/>
+      </w:pPr>
+      <w:r>
+        <w:t>**儲存設定**：點擊儲存後，雲端試算表設定檔將同步更新，Apps Script 定時排程亦會自動重建。</w:t>
       </w:r>
     </w:p>
     <w:p>
@@ -236,7 +300,7 @@
         <w:pStyle w:val="Heading3"/>
       </w:pPr>
       <w:r>
-        <w:t>3. 👥 聯絡人名冊 (Contacts)</w:t>
+        <w:t>3. 👥 聯絡人名冊 (Contacts) (需密碼解鎖)</w:t>
       </w:r>
     </w:p>
     <w:p>
@@ -489,7 +553,7 @@
         <w:pStyle w:val="ListBullet"/>
       </w:pPr>
       <w:r>
-        <w:t>**`系統設定` 工作表**：包含閾值、監測開始與結束整點、頻率。修改此分頁後，必須點選試算表上方選單 **`🌡️ 溫度通報系統` -&gt; `⚙️ 套用設定並更新排程`** 才能生效。</w:t>
+        <w:t>**`系統設定` 工作表**：包含閾值、監測開始與結束整點、頻率、以及管理網頁密碼（預設 `admin888`，寫在第 5 列）。修改此分頁後，必須點選試算表上方選單 **`🌡️ 溫度通報系統` -&gt; `⚙️ 套用設定並更新排程`** 才能生效。</w:t>
       </w:r>
     </w:p>
     <w:p>

</xml_diff>

<commit_message>
feat: upgrade to v4.7, align XX:58 heartbeat, fix HMI history query syntax error, implement GAS auto sheet-change sync, and update documentation formats
</commit_message>
<xml_diff>
--- a/溫度通報/溫度通報系統操作說明.docx
+++ b/溫度通報/溫度通報系統操作說明.docx
@@ -7,12 +7,17 @@
         <w:pStyle w:val="Heading1"/>
       </w:pPr>
       <w:r>
-        <w:t>彰化縣線西鄉環境溫度監控與通報系統 — 操作與維護說明書 (v4.1)</w:t>
+        <w:t>彰化縣線西鄉環境溫度監控與雙軌備援通報系統 — 操作與維護說明書 (v4.7)</w:t>
       </w:r>
     </w:p>
     <w:p>
       <w:r>
-        <w:t>本系統整合了**本機 Python 排程程式（主要端）**與 **Google Apps Script 雲端腳本（備援端與 HMI 門面）**，實現 24 小時不間斷的天氣觀測與雙向狀態同步，當溫度高於設定閾值時將發送 LINE 及 Email 通知。</w:t>
+        <w:t>本系統為**混合架構雙備援通報系統**，整合了**本機 Python 排程程式（主要端）**、**Google Apps Script 雲端腳本（備援端與安全設定後端）**，以及 **Firebase 即時監控人機介面（HMI 儀表板）**。</w:t>
+      </w:r>
+    </w:p>
+    <w:p>
+      <w:r>
+        <w:t>系統實現 24 小時不間斷的天氣觀測與雙向狀態同步，當溫度高於設定閾值時將透過 LINE 及 Email 發送通知，提供工業級的高可用性與簡便的行動化管理。</w:t>
       </w:r>
     </w:p>
     <w:p>
@@ -25,56 +30,91 @@
         <w:pStyle w:val="Heading2"/>
       </w:pPr>
       <w:r>
-        <w:t>🧭 系統架構與運作邏輯</w:t>
+        <w:t>🏗️ 系統架構與運作邏輯</w:t>
       </w:r>
     </w:p>
     <w:p>
       <w:pPr>
+        <w:spacing w:after="120"/>
         <w:ind w:left="432"/>
       </w:pPr>
       <w:r>
         <w:rPr>
           <w:rFonts w:ascii="Consolas" w:hAnsi="Consolas"/>
-          <w:sz w:val="18"/>
+          <w:sz w:val="19"/>
         </w:rPr>
-        <w:t xml:space="preserve">                        ┌─────────────────────────┐</w:t>
+        <w:t xml:space="preserve">                         ┌─────────────────────────────┐</w:t>
         <w:br/>
-        <w:t xml:space="preserve">                        │   Google 試算表 (雲端)   │</w:t>
+        <w:t xml:space="preserve">                         │    Google 試算表 (雲端 DB)   │</w:t>
         <w:br/>
-        <w:t xml:space="preserve">                        └────────────┬────────────┘</w:t>
+        <w:t xml:space="preserve">                         │ - 系統設定 (閾值/時段/密碼)   │</w:t>
         <w:br/>
-        <w:t xml:space="preserve">                                     │ (RPC 通訊 / 試算表讀寫)</w:t>
+        <w:t xml:space="preserve">                         │ - 紀錄_YYYY-MM (歷史歸檔)   │</w:t>
         <w:br/>
-        <w:t xml:space="preserve">                  ┌──────────────────┴──────────────────┐</w:t>
+        <w:t xml:space="preserve">                         └──────────────┬──────────────┘</w:t>
         <w:br/>
-        <w:t xml:space="preserve">                  ▼                                     ▼</w:t>
+        <w:t xml:space="preserve">                                        │</w:t>
         <w:br/>
-        <w:t xml:space="preserve">       ┌─────────────────────┐               ┌─────────────────────┐</w:t>
+        <w:t xml:space="preserve">           ┌────────────────────────────┼────────────────────────────┐</w:t>
         <w:br/>
-        <w:t xml:space="preserve">       │  本機 Python 腳本   │               │   HMI 人機管理網頁  │</w:t>
+        <w:t xml:space="preserve">           ▼ (主要監測端)               ▼ (備援監測端)               ▼ (同步工具)</w:t>
         <w:br/>
-        <w:t xml:space="preserve">       │   (每小時定時排程)   │               │   (Web App 瀏覽器)   │</w:t>
+        <w:t xml:space="preserve">  ┌─────────────────┐          ┌─────────────────┐          ┌─────────────────────┐</w:t>
         <w:br/>
-        <w:t xml:space="preserve">       └──────────┬──────────┘               └──────────┬──────────┘</w:t>
+        <w:t xml:space="preserve">  │  本機 Python    │          │  Google Apps    │          │  sync_sheet_to_     │</w:t>
         <w:br/>
-        <w:t xml:space="preserve">                  │ (POST 心跳訊號)                     │ (google.script.run)</w:t>
+        <w:t xml:space="preserve">  │  weather_       │          │  Script 雲端    │          │  firebase.py        │</w:t>
         <w:br/>
-        <w:t xml:space="preserve">                  │                                     │</w:t>
+        <w:t xml:space="preserve">  │  monitor.py     │          │  checkWeather   │          │  (手動補資料用)     │</w:t>
         <w:br/>
-        <w:t xml:space="preserve">                  ▼                                     ▼</w:t>
+        <w:t xml:space="preserve">  │  (每10分鐘執行)  │          │  (每小時執行)    │          │                     │</w:t>
         <w:br/>
-        <w:t xml:space="preserve">       ┌─────────────────────────────────────────────────────┐</w:t>
+        <w:t xml:space="preserve">  └────────┬────────┘          └────────┬────────┘          └──────────┬──────────┘</w:t>
         <w:br/>
-        <w:t xml:space="preserve">       │           Google Apps Script 雲端處理中心            │</w:t>
+        <w:t xml:space="preserve">           │                            │                              │</w:t>
         <w:br/>
-        <w:t xml:space="preserve">       │  - doGet(e) ：偵測到瀏覽器請求，輸出 HMI 網頁畫面     │</w:t>
+        <w:t xml:space="preserve">           ├────────────────────────────┴──────────────────────────────┤</w:t>
         <w:br/>
-        <w:t xml:space="preserve">       │  - doPost(e)：接收本機心跳與狀態同步數據            │</w:t>
+        <w:t xml:space="preserve">           │  雙向寫入數據與狀態</w:t>
         <w:br/>
-        <w:t xml:space="preserve">       │  - 備援排程  ：若本機無心跳，雲端自動接管溫度監測與通知│</w:t>
+        <w:t xml:space="preserve">           ▼</w:t>
         <w:br/>
-        <w:t xml:space="preserve">       └─────────────────────────────────────────────────────┘</w:t>
+        <w:t xml:space="preserve">  ┌──────────────────────────────────────────────────────────────────────┐</w:t>
         <w:br/>
+        <w:t xml:space="preserve">  │                    Firebase Firestore 即時資料庫                     │</w:t>
+        <w:br/>
+        <w:t xml:space="preserve">  │  - realtime_data/status  ← 即時溫度、三態心跳燈、閾值與警報狀態       │</w:t>
+        <w:br/>
+        <w:t xml:space="preserve">  │  - history_logs/         ← 歷史通報明細（每筆一份文件）               │</w:t>
+        <w:br/>
+        <w:t xml:space="preserve">  │  - contacts/             │ 聯絡人名冊與啟閉狀態                       │</w:t>
+        <w:br/>
+        <w:t xml:space="preserve">  └───────────────────────────────┬──────────────────────────────────────┘</w:t>
+        <w:br/>
+        <w:t xml:space="preserve">                                  │ 即時推播 (Firestore onSnapshot)</w:t>
+        <w:br/>
+        <w:t xml:space="preserve">                                  ▼</w:t>
+        <w:br/>
+        <w:t xml:space="preserve">                     ┌─────────────────────────┐</w:t>
+        <w:br/>
+        <w:t xml:space="preserve">                     │   Firebase HMI 儀表板   │</w:t>
+        <w:br/>
+        <w:t xml:space="preserve">                     │  (任意行動/桌面裝置可開) │</w:t>
+        <w:br/>
+        <w:t xml:space="preserve">                     │  https://hongsheng-     │</w:t>
+        <w:br/>
+        <w:t xml:space="preserve">                     │  temp-523.web.app        │</w:t>
+        <w:br/>
+        <w:t xml:space="preserve">                     └─────────────────────────┘</w:t>
+        <w:br/>
+      </w:r>
+    </w:p>
+    <w:p>
+      <w:pPr>
+        <w:pStyle w:val="Heading3"/>
+      </w:pPr>
+      <w:r>
+        <w:t>雙備援運作邏輯</w:t>
       </w:r>
     </w:p>
     <w:p>
@@ -82,7 +122,7 @@
         <w:pStyle w:val="ListNumber"/>
       </w:pPr>
       <w:r>
-        <w:t>**本機主要端**：透過 Windows 工作排程器每小時執行一次，執行時會先與雲端同步警報狀態，並在執行完成後向雲端發送心跳與觀測數據。</w:t>
+        <w:t>**本機主要端**：透過 Windows 工作排程器設定**每天 07:58 至 23:58 之間每 10 分鐘**執行一次。它會抓取氣象署伸港站 API 最新溫度，並在執行完成後向 **Firebase Firestore** 與 **GAS Web App** 雙向發送心跳與觀測數據。</w:t>
       </w:r>
     </w:p>
     <w:p>
@@ -90,7 +130,7 @@
         <w:pStyle w:val="ListNumber"/>
       </w:pPr>
       <w:r>
-        <w:t>**雲端備援端**：每小時排程啟動時檢查本機心跳。若本機在指定時間內有活躍紀錄，雲端會自動跳過本次排程；若本機電腦關機或網絡中斷（無心跳），雲端將接管觀測並發送通知，並在通報紀錄中註記 `(雲端備援)`。</w:t>
+        <w:t>**雲端備援端**：每小時排程自動啟動時檢查本機心跳。若本機在指定時間內有活躍紀錄，雲端會自動跳過本次排程；若本機電腦關機、斷電或網絡中斷（無心跳），雲端將接管觀測並發送通知，並在通報紀錄中註記 `(雲端備援)`。</w:t>
       </w:r>
     </w:p>
     <w:p>
@@ -98,7 +138,7 @@
         <w:pStyle w:val="ListNumber"/>
       </w:pPr>
       <w:r>
-        <w:t>**雲端人機端 (HMI)**：當人員開啟 Web App 網址時，會顯示響應式的深色科技風人機網頁，不需進入試算表即可修改閾值/時段、管理聯絡人並查詢與匯出歷史溫度紀錄。</w:t>
+        <w:t>**即時數據庫同步**：本機程式與雲端 GAS 均可讀寫 Firebase Firestore，確保 Firebase HMI 即時儀表板與試算表數據保持最新狀態。</w:t>
       </w:r>
     </w:p>
     <w:p>
@@ -114,7 +154,7 @@
         <w:pStyle w:val="ListBullet"/>
       </w:pPr>
       <w:r>
-        <w:t>**數據來源**：中華民國交通部中央氣象署 (CWA) 開放資料平台 API (資料集編號：`O-A0003-001`)。</w:t>
+        <w:t>**氣象數據源**：中華民國交通部中央氣象署 (CWA) 開放資料平台 API。</w:t>
       </w:r>
     </w:p>
     <w:p>
@@ -122,7 +162,7 @@
         <w:pStyle w:val="ListBullet"/>
       </w:pPr>
       <w:r>
-        <w:t>**抓取站點**：彰化縣伸港鄉「伸港觀測站」（站點編號：`C2G870`），提供 10 分鐘即時更新。</w:t>
+        <w:t>**觀測站點**：彰化縣伸港鄉「伸港觀測站」（站點編號：`C2G870`），提供 10 分鐘即時更新。</w:t>
       </w:r>
     </w:p>
     <w:p>
@@ -130,7 +170,7 @@
         <w:pStyle w:val="ListBullet"/>
       </w:pPr>
       <w:r>
-        <w:t>**抓取指標**：即時環境溫度/乾球溫度（即氣象署 API 中的 `AirTemperature` 欄位）。</w:t>
+        <w:t>**抓取指標**：即時環境溫度 / 乾球溫度（API 中之 `AirTemperature` 欄位）。</w:t>
       </w:r>
     </w:p>
     <w:p>
@@ -143,12 +183,12 @@
         <w:pStyle w:val="Heading2"/>
       </w:pPr>
       <w:r>
-        <w:t>🖥️ HMI 人機介面操作指南 (已針對手機端與密碼保護優化)</w:t>
+        <w:t>🖥️ 雙軌 HMI 人機介面操作指南</w:t>
       </w:r>
     </w:p>
     <w:p>
       <w:r>
-        <w:t>管理人員不需直接開啟 Google 試算表。只需在瀏覽器（支援手機與電腦）開啟部署所取得的 **Web App 網址**，即可進行所有日常維護：</w:t>
+        <w:t>系統提供兩個相輔相成的人機操作介面，管理人員不需直接開啟 Google 試算表即可輕鬆進行日常維護。</w:t>
       </w:r>
     </w:p>
     <w:p>
@@ -156,7 +196,26 @@
         <w:pStyle w:val="Heading3"/>
       </w:pPr>
       <w:r>
-        <w:t>🔑 安全防護與登出</w:t>
+        <w:t>1. Firebase HMI 即時監控網頁 (任意行動/桌面裝置)</w:t>
+      </w:r>
+    </w:p>
+    <w:p>
+      <w:r>
+        <w:t>在瀏覽器開啟以下網頁（免安裝 App，資料每秒即時同步更新）：</w:t>
+      </w:r>
+    </w:p>
+    <w:p>
+      <w:pPr>
+        <w:spacing w:after="120"/>
+        <w:ind w:left="432"/>
+      </w:pPr>
+      <w:r>
+        <w:rPr>
+          <w:rFonts w:ascii="Consolas" w:hAnsi="Consolas"/>
+          <w:sz w:val="19"/>
+        </w:rPr>
+        <w:t>https://hongsheng-temp-523.web.app</w:t>
+        <w:br/>
       </w:r>
     </w:p>
     <w:p>
@@ -164,7 +223,7 @@
         <w:pStyle w:val="ListBullet"/>
       </w:pPr>
       <w:r>
-        <w:t>**身份驗證**：進入「系統設定」、「聯絡人名冊」或點擊測試按鈕時，系統會要求輸入管理密碼。預設密碼為 **`admin888`**。</w:t>
+        <w:t>**📊 儀表板首頁**：</w:t>
       </w:r>
     </w:p>
     <w:p>
@@ -172,7 +231,7 @@
         <w:pStyle w:val="ListBullet"/>
       </w:pPr>
       <w:r>
-        <w:t>**解鎖工作**：成功解鎖後即可進入操作，並且會在瀏覽器階段快取（Session）中保存登入狀態。</w:t>
+        <w:t>**環形溫度計**：大字級顯示即時溫度，圓環顏色隨溫度狀態變色（正常：綠色、接近閾值：黃色、高溫超標：紅色呼吸發光）。</w:t>
       </w:r>
     </w:p>
     <w:p>
@@ -180,7 +239,55 @@
         <w:pStyle w:val="ListBullet"/>
       </w:pPr>
       <w:r>
-        <w:t>**安全登出**：點擊網頁右上角（或側邊欄最下方）的「登出」按鈕，即可清除快取狀態，重新鎖定網頁，防止其他人操作。</w:t>
+        <w:t>**心跳燈狀態**：</w:t>
+      </w:r>
+    </w:p>
+    <w:p>
+      <w:pPr>
+        <w:pStyle w:val="ListBullet"/>
+      </w:pPr>
+      <w:r>
+        <w:t>🟢 **在線 (正常)**：本機電腦正常運作並定時上報心跳。</w:t>
+      </w:r>
+    </w:p>
+    <w:p>
+      <w:pPr>
+        <w:pStyle w:val="ListBullet"/>
+      </w:pPr>
+      <w:r>
+        <w:t>🟡 **雲端監控（本機異常）**（琥珀色閃爍）：本機電腦已斷開（可能斷電/斷網），雲端備援已接手。</w:t>
+      </w:r>
+    </w:p>
+    <w:p>
+      <w:pPr>
+        <w:pStyle w:val="ListBullet"/>
+      </w:pPr>
+      <w:r>
+        <w:t>🔴 **離線警報**：本機與雲端備援皆無上報心跳，請立即前往機房檢查。</w:t>
+      </w:r>
+    </w:p>
+    <w:p>
+      <w:pPr>
+        <w:pStyle w:val="ListBullet"/>
+      </w:pPr>
+      <w:r>
+        <w:t>**⚙️ 系統設定（需輸入管理密碼）**：可調整警報溫度閥值（°C）、監控時段與密碼。*(注意：此處修改僅直接寫入 Firebase 供網頁呈現。若要同步至本機與試算表，需手動執行同步工具)*。</w:t>
+      </w:r>
+    </w:p>
+    <w:p>
+      <w:pPr>
+        <w:pStyle w:val="ListBullet"/>
+      </w:pPr>
+      <w:r>
+        <w:t>**👥 聯絡名冊（需輸入管理密碼）**：可於網頁直接新增、編輯、刪除或一鍵勾選「啟用/停用」LINE/Email 收件人，儲存後即時生效。</w:t>
+      </w:r>
+    </w:p>
+    <w:p>
+      <w:pPr>
+        <w:pStyle w:val="ListBullet"/>
+      </w:pPr>
+      <w:r>
+        <w:t>**📋 通報紀錄**：顯示最近 100 筆通報明細，支援即時搜尋關鍵字（如「高溫」、「LINE」、「備援」），並提供「匯出 CSV」一鍵下載為 Excel 檔案。</w:t>
       </w:r>
     </w:p>
     <w:p>
@@ -188,7 +295,12 @@
         <w:pStyle w:val="Heading3"/>
       </w:pPr>
       <w:r>
-        <w:t>📱 手機介面特別優化</w:t>
+        <w:t>2. GAS Web App 安全管理設定入口 (試算表後端)</w:t>
+      </w:r>
+    </w:p>
+    <w:p>
+      <w:r>
+        <w:t>透過 Google Apps Script 部署所得的 **Web App 網址**進入：</w:t>
       </w:r>
     </w:p>
     <w:p>
@@ -196,7 +308,7 @@
         <w:pStyle w:val="ListBullet"/>
       </w:pPr>
       <w:r>
-        <w:t>**底部導覽列**：使用手機存取時，系統會將左側選單優化為底部懸浮導覽列，符合行動單手操作。</w:t>
+        <w:t>**安全性密碼驗證**：進入系統設定、管理聯絡人或點擊測試按鈕時，系統會要求輸入管理密碼（預設密碼為 **`admin888`**），成功解鎖後會保持登入狀態，並提供右上角「安全登出」功能。</w:t>
       </w:r>
     </w:p>
     <w:p>
@@ -204,15 +316,7 @@
         <w:pStyle w:val="ListBullet"/>
       </w:pPr>
       <w:r>
-        <w:t>**Swipe 表格滑動**：表格欄位支援手勢橫向滑動，避免資料擠壓變形，方便在小螢幕查看 LINE ID 與 Email。</w:t>
-      </w:r>
-    </w:p>
-    <w:p>
-      <w:pPr>
-        <w:pStyle w:val="Heading3"/>
-      </w:pPr>
-      <w:r>
-        <w:t>1. 📊 狀態儀表板 (Dashboard)</w:t>
+        <w:t>**手機窄螢幕適配**：</w:t>
       </w:r>
     </w:p>
     <w:p>
@@ -220,7 +324,7 @@
         <w:pStyle w:val="ListBullet"/>
       </w:pPr>
       <w:r>
-        <w:t>**即時氣溫圓形儀表 (Gauge)**：大字顯示伸港測站最新溫度，顏色會依據氣溫自動轉變（正常：綠色、接近閾值：黃色、超標：紅色呼吸發光）。</w:t>
+        <w:t>當螢幕寬度 &lt;= 768px 時，左側側邊欄會自動轉換為**底部懸浮導覽列**，方便單手觸碰。</w:t>
       </w:r>
     </w:p>
     <w:p>
@@ -228,135 +332,7 @@
         <w:pStyle w:val="ListBullet"/>
       </w:pPr>
       <w:r>
-        <w:t>**氣象發布時間**：顯示中央氣象署最新氣溫發布的時間。</w:t>
-      </w:r>
-    </w:p>
-    <w:p>
-      <w:pPr>
-        <w:pStyle w:val="ListBullet"/>
-      </w:pPr>
-      <w:r>
-        <w:t>**本機心跳狀態**：顯示本機 Python 程式最後執行時間與「在線/離線狀態」。若狀態顯示「離線警報」，代表本機可能中斷或斷網，此時雲端將自動接管通報任務。</w:t>
-      </w:r>
-    </w:p>
-    <w:p>
-      <w:pPr>
-        <w:pStyle w:val="ListBullet"/>
-      </w:pPr>
-      <w:r>
-        <w:t>**快速工具**：提供三個一鍵測試按鈕（強制測試發送 LINE/信件、清除重複通報鎖定、重設紀錄分頁欄寬）。</w:t>
-      </w:r>
-    </w:p>
-    <w:p>
-      <w:pPr>
-        <w:pStyle w:val="Heading3"/>
-      </w:pPr>
-      <w:r>
-        <w:t>2. ⚙️ 系統設定管理 (Settings) (需密碼解鎖)</w:t>
-      </w:r>
-    </w:p>
-    <w:p>
-      <w:pPr>
-        <w:pStyle w:val="ListBullet"/>
-      </w:pPr>
-      <w:r>
-        <w:t>**溫度警報閾值設定**：拖曳拉桿調整閾值，支援小數點（如 `28.5`°C）。</w:t>
-      </w:r>
-    </w:p>
-    <w:p>
-      <w:pPr>
-        <w:pStyle w:val="ListBullet"/>
-      </w:pPr>
-      <w:r>
-        <w:t>**監測時段設定**：選擇開始與結束小時，自動支援跨夜（如開始 22 點、結束 6 點）。</w:t>
-      </w:r>
-    </w:p>
-    <w:p>
-      <w:pPr>
-        <w:pStyle w:val="ListBullet"/>
-      </w:pPr>
-      <w:r>
-        <w:t>**檢查頻率調整**：可調整雲端定時檢查的頻率（10, 15, 30, 60 分鐘）。</w:t>
-      </w:r>
-    </w:p>
-    <w:p>
-      <w:pPr>
-        <w:pStyle w:val="ListBullet"/>
-      </w:pPr>
-      <w:r>
-        <w:t>**密碼更改功能**：可在「管理網頁密碼」欄位填入新密碼以進行修改（不修改請留空）。</w:t>
-      </w:r>
-    </w:p>
-    <w:p>
-      <w:pPr>
-        <w:pStyle w:val="ListBullet"/>
-      </w:pPr>
-      <w:r>
-        <w:t>**儲存設定**：點擊儲存後，雲端試算表設定檔將同步更新，Apps Script 定時排程亦會自動重建。</w:t>
-      </w:r>
-    </w:p>
-    <w:p>
-      <w:pPr>
-        <w:pStyle w:val="Heading3"/>
-      </w:pPr>
-      <w:r>
-        <w:t>3. 👥 聯絡人名冊 (Contacts) (需密碼解鎖)</w:t>
-      </w:r>
-    </w:p>
-    <w:p>
-      <w:pPr>
-        <w:pStyle w:val="ListBullet"/>
-      </w:pPr>
-      <w:r>
-        <w:t>**快速切換啟用開關**：直接點選表格中的開關（Toggle Switch）即可立即「啟用」或「停用」某聯絡人，系統會即時存檔。</w:t>
-      </w:r>
-    </w:p>
-    <w:p>
-      <w:pPr>
-        <w:pStyle w:val="ListBullet"/>
-      </w:pPr>
-      <w:r>
-        <w:t>**新增聯絡人**：點選右上角「新增聯絡收件人」開啟表單，輸入姓名、Email 與 LINE ID。LINE ID 必須以大寫 U (個人)、C (群組) 或 R (聊天室) 開頭。</w:t>
-      </w:r>
-    </w:p>
-    <w:p>
-      <w:pPr>
-        <w:pStyle w:val="ListBullet"/>
-      </w:pPr>
-      <w:r>
-        <w:t>**刪除聯絡人**：點擊每列後方的紅色垃圾桶圖示並確認即可移除。</w:t>
-      </w:r>
-    </w:p>
-    <w:p>
-      <w:pPr>
-        <w:pStyle w:val="Heading3"/>
-      </w:pPr>
-      <w:r>
-        <w:t>4. 📜 歷史通報紀錄 (History Logs)</w:t>
-      </w:r>
-    </w:p>
-    <w:p>
-      <w:pPr>
-        <w:pStyle w:val="ListBullet"/>
-      </w:pPr>
-      <w:r>
-        <w:t>**紀錄表格**：顯示當月份 `紀錄_YYYY-MM` 分頁中最新 100 筆數據。</w:t>
-      </w:r>
-    </w:p>
-    <w:p>
-      <w:pPr>
-        <w:pStyle w:val="ListBullet"/>
-      </w:pPr>
-      <w:r>
-        <w:t>**篩選與搜尋**：在搜尋框輸入關鍵字（例如時間、超標、LINE、備援、心跳），即可即時過濾表格內容。</w:t>
-      </w:r>
-    </w:p>
-    <w:p>
-      <w:pPr>
-        <w:pStyle w:val="ListBullet"/>
-      </w:pPr>
-      <w:r>
-        <w:t>**匯出本頁 CSV**：點擊「匯出本頁 CSV」一鍵將篩選後的紀錄下載為 CSV 格式檔案，方便後續稽核與分析。</w:t>
+        <w:t>表格支援**手勢橫向滑動 (Swipe-scroll)**，避免 LINE ID 與 Email 在手機上被截斷或擠壓換行。</w:t>
       </w:r>
     </w:p>
     <w:p>
@@ -382,17 +358,18 @@
     </w:p>
     <w:p>
       <w:r>
-        <w:t>本機程式設定檔位於 `溫度通報/config.json`，請確認以下關鍵設定：</w:t>
+        <w:t>本機程式設定檔位於 `C:\GOOGLE ANGET\溫度通報\config.json`：</w:t>
       </w:r>
     </w:p>
     <w:p>
       <w:pPr>
+        <w:spacing w:after="120"/>
         <w:ind w:left="432"/>
       </w:pPr>
       <w:r>
         <w:rPr>
           <w:rFonts w:ascii="Consolas" w:hAnsi="Consolas"/>
-          <w:sz w:val="18"/>
+          <w:sz w:val="19"/>
         </w:rPr>
         <w:t>{</w:t>
         <w:br/>
@@ -400,25 +377,29 @@
         <w:br/>
         <w:t xml:space="preserve">  "town_name": "彰化縣線西鄉",</w:t>
         <w:br/>
+        <w:t xml:space="preserve">  "cwa_api_key": "CWA-XXXXXXXX-XXXX-XXXX-XXXX-XXXXXXXXXXXX",</w:t>
+        <w:br/>
+        <w:t xml:space="preserve">  "cwa_station_id": "C2G870",</w:t>
+        <w:br/>
         <w:t xml:space="preserve">  "temperature_threshold": 28.0,</w:t>
         <w:br/>
         <w:t xml:space="preserve">  "mode": "both",</w:t>
         <w:br/>
-        <w:t xml:space="preserve">  "google_sheet_csv_url": "您的Google試算表已發布CSV網址",</w:t>
+        <w:t xml:space="preserve">  "google_sheet_csv_url": "您的試算表已發布CSV網址",</w:t>
         <w:br/>
-        <w:t xml:space="preserve">  "web_app_url": "您的Google Apps Script網頁應用程式部署網址",</w:t>
+        <w:t xml:space="preserve">  "web_app_url": "您的Google Apps Script Web App部署網址",</w:t>
         <w:br/>
         <w:t xml:space="preserve">  "line": {</w:t>
         <w:br/>
         <w:t xml:space="preserve">    "enabled": true,</w:t>
         <w:br/>
-        <w:t xml:space="preserve">    "channel_access_token": "您的LINE Bot Channel Access Token",</w:t>
+        <w:t xml:space="preserve">    "channel_access_token": "您的LINE Bot Token",</w:t>
         <w:br/>
         <w:t xml:space="preserve">    "to": [</w:t>
         <w:br/>
-        <w:t xml:space="preserve">      "U1234567890abcdef...",</w:t>
+        <w:t xml:space="preserve">      "Uxxxxxxxxxxxxxxxxxxxxxxxxxxxxxxxx",</w:t>
         <w:br/>
-        <w:t xml:space="preserve">      "C10943136364033b..."</w:t>
+        <w:t xml:space="preserve">      "Cxxxxxxxxxxxxxxxxxxxxxxxxxxxxxxxx"</w:t>
         <w:br/>
         <w:t xml:space="preserve">    ]</w:t>
         <w:br/>
@@ -432,17 +413,17 @@
         <w:br/>
         <w:t xml:space="preserve">    "smtp_port": 587,</w:t>
         <w:br/>
-        <w:t xml:space="preserve">    "smtp_user": "您的Gmail信箱@gmail.com",</w:t>
+        <w:t xml:space="preserve">    "smtp_user": "您的發信信箱@gmail.com",</w:t>
         <w:br/>
-        <w:t xml:space="preserve">    "smtp_password": "您的Gmail應用程式16位密碼",</w:t>
+        <w:t xml:space="preserve">    "smtp_password": "您的16位應用程式密碼",</w:t>
         <w:br/>
         <w:t xml:space="preserve">    "to_email": [</w:t>
         <w:br/>
-        <w:t xml:space="preserve">      "收件者信箱@gmail.com"</w:t>
+        <w:t xml:space="preserve">      "收信人信箱@gmail.com"</w:t>
         <w:br/>
         <w:t xml:space="preserve">    ],</w:t>
         <w:br/>
-        <w:t xml:space="preserve">    "from_email": "您的Gmail信箱@gmail.com"</w:t>
+        <w:t xml:space="preserve">    "from_email": "您的發信信箱@gmail.com"</w:t>
         <w:br/>
         <w:t xml:space="preserve">  }</w:t>
         <w:br/>
@@ -452,10 +433,96 @@
     </w:p>
     <w:p>
       <w:pPr>
+        <w:ind w:left="288"/>
+      </w:pPr>
+      <w:r>
+        <w:rPr>
+          <w:i/>
+        </w:rPr>
+        <w:t>**說明**：</w:t>
+      </w:r>
+    </w:p>
+    <w:p>
+      <w:pPr>
+        <w:ind w:left="288"/>
+      </w:pPr>
+      <w:r>
+        <w:rPr>
+          <w:i/>
+        </w:rPr>
+        <w:t>- `web_app_url`：為 GAS 網頁部署網址。本機程式會在每次執行時透過此 URL 回傳心跳與數據以更新試算表。</w:t>
+      </w:r>
+    </w:p>
+    <w:p>
+      <w:pPr>
+        <w:ind w:left="288"/>
+      </w:pPr>
+      <w:r>
+        <w:rPr>
+          <w:i/>
+        </w:rPr>
+        <w:t>- `firebase_key.json`：本機程式亦會讀取同目錄下的 Service Account 私鑰，將心跳直接 Patch 寫入 Firebase Firestore，無須中轉，提供極速更新。</w:t>
+      </w:r>
+    </w:p>
+    <w:p>
+      <w:pPr>
         <w:pStyle w:val="Heading3"/>
       </w:pPr>
       <w:r>
-        <w:t>2. 設定 Windows 排程器自動執行</w:t>
+        <w:t>2. 必要檔案確認</w:t>
+      </w:r>
+    </w:p>
+    <w:p>
+      <w:r>
+        <w:t>請確認以下檔案存放在 `C:\GOOGLE ANGET\溫度通報\` 目錄下：</w:t>
+      </w:r>
+    </w:p>
+    <w:p>
+      <w:pPr>
+        <w:pStyle w:val="ListBullet"/>
+      </w:pPr>
+      <w:r>
+        <w:t>`config.json`：本機設定檔（含 LINE / SMTP 金鑰）。</w:t>
+      </w:r>
+    </w:p>
+    <w:p>
+      <w:pPr>
+        <w:pStyle w:val="ListBullet"/>
+      </w:pPr>
+      <w:r>
+        <w:t>`firebase_key.json`：Firebase 雲端資料庫連線私鑰。</w:t>
+      </w:r>
+    </w:p>
+    <w:p>
+      <w:pPr>
+        <w:pStyle w:val="ListBullet"/>
+      </w:pPr>
+      <w:r>
+        <w:t>`weather_monitor.py`：本機主監測程式.</w:t>
+      </w:r>
+    </w:p>
+    <w:p>
+      <w:pPr>
+        <w:pStyle w:val="ListBullet"/>
+      </w:pPr>
+      <w:r>
+        <w:t>`sync_sheet_to_firebase.py`：手動補資料同步工具。</w:t>
+      </w:r>
+    </w:p>
+    <w:p>
+      <w:pPr>
+        <w:pStyle w:val="ListBullet"/>
+      </w:pPr>
+      <w:r>
+        <w:t>`last_notified.json`：自動生成，記錄最後通報狀態（防重複）與最後執行時間。</w:t>
+      </w:r>
+    </w:p>
+    <w:p>
+      <w:pPr>
+        <w:pStyle w:val="Heading3"/>
+      </w:pPr>
+      <w:r>
+        <w:t>3. 設定 Windows 工作排程器 (每10分鐘更新)</w:t>
       </w:r>
     </w:p>
     <w:p>
@@ -463,7 +530,7 @@
         <w:pStyle w:val="ListNumber"/>
       </w:pPr>
       <w:r>
-        <w:t>按 `Win + R` 輸入 `taskschd.msc` 開啟工作排程器。</w:t>
+        <w:t>按下 `Win + R`，輸入 `taskschd.msc` 開啟工作排程器。</w:t>
       </w:r>
     </w:p>
     <w:p>
@@ -471,7 +538,7 @@
         <w:pStyle w:val="ListNumber"/>
       </w:pPr>
       <w:r>
-        <w:t>右側點擊 **「建立基本工作」**，輸入名稱（例如 `環境溫度通報系統`）。</w:t>
+        <w:t>於右側點選「建立基本工作」，名稱輸入「`環境溫度監控通報系統`」。</w:t>
       </w:r>
     </w:p>
     <w:p>
@@ -479,7 +546,15 @@
         <w:pStyle w:val="ListNumber"/>
       </w:pPr>
       <w:r>
-        <w:t>動作選擇 **「啟動程式」**：</w:t>
+        <w:t>觸發程序選擇「每天」，執行時間設定為「`07:58`」AM。</w:t>
+      </w:r>
+    </w:p>
+    <w:p>
+      <w:pPr>
+        <w:pStyle w:val="ListNumber"/>
+      </w:pPr>
+      <w:r>
+        <w:t>動作選擇「啟動程式」：</w:t>
       </w:r>
     </w:p>
     <w:p>
@@ -487,7 +562,7 @@
         <w:pStyle w:val="ListBullet"/>
       </w:pPr>
       <w:r>
-        <w:t>**程式或指令碼**：填入您的 python 執行路徑（例如 `python`）。</w:t>
+        <w:t>**程式或指令碼**：`python`（若未加入系統環境變數，請使用 python.exe 完整路徑）</w:t>
       </w:r>
     </w:p>
     <w:p>
@@ -503,7 +578,7 @@
         <w:pStyle w:val="ListBullet"/>
       </w:pPr>
       <w:r>
-        <w:t>**開始位置**：`d:\GOOGLE ANGET\溫度通報` (請依據您的實際目錄修改)</w:t>
+        <w:t>**開始位置**：`C:\GOOGLE ANGET\溫度通報`</w:t>
       </w:r>
     </w:p>
     <w:p>
@@ -511,7 +586,39 @@
         <w:pStyle w:val="ListNumber"/>
       </w:pPr>
       <w:r>
-        <w:t>在建立後，對工作按右鍵 -&gt; **「內容」**，可於「觸發程序」頁面點選編輯，並勾選「重複工作間隔」為 **「1 小時」**，持續時間為「無限期」，以達到每小時自動執行的效果。</w:t>
+        <w:t>建立完成後，在清單中找到該排程，右鍵點擊選擇「內容」：</w:t>
+      </w:r>
+    </w:p>
+    <w:p>
+      <w:pPr>
+        <w:pStyle w:val="ListBullet"/>
+      </w:pPr>
+      <w:r>
+        <w:t>切換至「觸發程序」頁籤，按「編輯」。</w:t>
+      </w:r>
+    </w:p>
+    <w:p>
+      <w:pPr>
+        <w:pStyle w:val="ListBullet"/>
+      </w:pPr>
+      <w:r>
+        <w:t>勾選「重複工作間隔」，設定為「`10 分鐘`」。</w:t>
+      </w:r>
+    </w:p>
+    <w:p>
+      <w:pPr>
+        <w:pStyle w:val="ListBullet"/>
+      </w:pPr>
+      <w:r>
+        <w:t>持續時間選擇「`1 天`」。</w:t>
+      </w:r>
+    </w:p>
+    <w:p>
+      <w:pPr>
+        <w:pStyle w:val="ListBullet"/>
+      </w:pPr>
+      <w:r>
+        <w:t>點擊確定儲存。</w:t>
       </w:r>
     </w:p>
     <w:p>
@@ -519,7 +626,7 @@
         <w:pStyle w:val="ListNumber"/>
       </w:pPr>
       <w:r>
-        <w:t>*本機排程自動節流*：本機程式會自動讀取 HMI 網頁中設定的「監測頻率」，若檢查間隔時間未到，程式會自動靜默結束，因此本機排程可以設定得比監測頻率更頻繁，系統會自行處理節流。</w:t>
+        <w:t>這將確保系統在每天 07:58 AM 開始，每 10 分鐘執行一次監控，直到晚上 23:58 PM 進行當天最後一次監控。</w:t>
       </w:r>
     </w:p>
     <w:p>
@@ -532,7 +639,100 @@
         <w:pStyle w:val="Heading2"/>
       </w:pPr>
       <w:r>
-        <w:t>🕹️ 雲端後台管理與進階維護</w:t>
+        <w:t>☁️ Google Apps Script (GAS) 雲端備援設定</w:t>
+      </w:r>
+    </w:p>
+    <w:p>
+      <w:pPr>
+        <w:pStyle w:val="ListNumber"/>
+      </w:pPr>
+      <w:r>
+        <w:t>**更新 Code**：開啟 Google 試算表 → 擴充功能 → Apps Script。開啟 `Code.gs` 全選清除，並將最新代碼貼上，按 Ctrl+S 存檔。</w:t>
+      </w:r>
+    </w:p>
+    <w:p>
+      <w:pPr>
+        <w:pStyle w:val="ListNumber"/>
+      </w:pPr>
+      <w:r>
+        <w:t>**管理部署**：點選 部署 → 管理部署。選取現有版本，點選編輯（鉛筆）並選擇「建立新版本」後進行部署。複製產出的網頁應用程式 URL，填入本機的 `config.json` 中。</w:t>
+      </w:r>
+    </w:p>
+    <w:p>
+      <w:pPr>
+        <w:pStyle w:val="ListNumber"/>
+      </w:pPr>
+      <w:r>
+        <w:t>**定時觸發器設定**：</w:t>
+      </w:r>
+    </w:p>
+    <w:p>
+      <w:pPr>
+        <w:pStyle w:val="ListBullet"/>
+      </w:pPr>
+      <w:r>
+        <w:t>點擊左側「時鐘」圖示（觸發條件）。</w:t>
+      </w:r>
+    </w:p>
+    <w:p>
+      <w:pPr>
+        <w:pStyle w:val="ListBullet"/>
+      </w:pPr>
+      <w:r>
+        <w:t>新增觸發條件：</w:t>
+      </w:r>
+    </w:p>
+    <w:p>
+      <w:pPr>
+        <w:pStyle w:val="ListBullet"/>
+      </w:pPr>
+      <w:r>
+        <w:t>執行功能：`checkWeatherAndNotify`</w:t>
+      </w:r>
+    </w:p>
+    <w:p>
+      <w:pPr>
+        <w:pStyle w:val="ListBullet"/>
+      </w:pPr>
+      <w:r>
+        <w:t>部署版本：選取剛建立的最新版本。</w:t>
+      </w:r>
+    </w:p>
+    <w:p>
+      <w:pPr>
+        <w:pStyle w:val="ListBullet"/>
+      </w:pPr>
+      <w:r>
+        <w:t>來源：時間型觸發程序。</w:t>
+      </w:r>
+    </w:p>
+    <w:p>
+      <w:pPr>
+        <w:pStyle w:val="ListBullet"/>
+      </w:pPr>
+      <w:r>
+        <w:t>時間間隔：每小時執行一次。</w:t>
+      </w:r>
+    </w:p>
+    <w:p>
+      <w:pPr>
+        <w:pStyle w:val="ListBullet"/>
+      </w:pPr>
+      <w:r>
+        <w:t>雲端備援在執行時，若發現本機最後心跳時間超過 70 分鐘，將自動在 Firebase 中將 `heartbeat_source` 寫入 `"cloud"`，此時 HMI 將顯示黃燈提醒人員本機已關機或斷網，隨後雲端將主動接管警報監控與發送。</w:t>
+      </w:r>
+    </w:p>
+    <w:p>
+      <w:r>
+        <w:t>---</w:t>
+      </w:r>
+    </w:p>
+    <w:p>
+      <w:pPr>
+        <w:pStyle w:val="Heading2"/>
+      </w:pPr>
+      <w:r>
+        <w:t>🔧 日常維護與手動同步工具</w:t>
       </w:r>
     </w:p>
     <w:p>
@@ -540,12 +740,12 @@
         <w:pStyle w:val="Heading3"/>
       </w:pPr>
       <w:r>
-        <w:t>1. 雲端試算表設定 (備用降級機制)</w:t>
+        <w:t>1. 試算表選單操作 (Google Sheet 端)</w:t>
       </w:r>
     </w:p>
     <w:p>
       <w:r>
-        <w:t>如果因瀏覽器相容性等極端原因無法開啟 HMI 網頁，您仍然可以直接在 Google 試算表中進行管理：</w:t>
+        <w:t>開啟試算表，頂端選單列會自動產生「`🌡️ 溫度通報系統`」的專屬工具選單：</w:t>
       </w:r>
     </w:p>
     <w:p>
@@ -553,7 +753,7 @@
         <w:pStyle w:val="ListBullet"/>
       </w:pPr>
       <w:r>
-        <w:t>**`系統設定` 工作表**：包含閾值、監測開始與結束整點、頻率、以及管理網頁密碼（預設 `admin888`，寫在第 5 列）。修改此分頁後，必須點選試算表上方選單 **`🌡️ 溫度通報系統` -&gt; `⚙️ 套用設定並更新排程`** 才能生效。</w:t>
+        <w:t>`🧪 測試即時通報`：忽略時段與防重複鎖定，立即向所有人發送測試 LINE 與 Email。</w:t>
       </w:r>
     </w:p>
     <w:p>
@@ -561,7 +761,7 @@
         <w:pStyle w:val="ListBullet"/>
       </w:pPr>
       <w:r>
-        <w:t>**第一工作表 (聯絡人)**：包含姓名、Email、LINE_ID、Enabled（填寫 `N` 或 `No` 代表停用）。</w:t>
+        <w:t>`🔄 重置防重複鎖定`：清除當天通知紀錄，下次超溫立即通報（不必等待溫度先降回常溫）。</w:t>
       </w:r>
     </w:p>
     <w:p>
@@ -569,7 +769,7 @@
         <w:pStyle w:val="ListBullet"/>
       </w:pPr>
       <w:r>
-        <w:t>**`紀錄_YYYY-MM` 工作表**：存放每月通報紀錄與心跳狀態。</w:t>
+        <w:t>`🔄 同步資料至 Firebase`：一鍵將試算表中的系統設定、聯絡名冊以及本月歷史通報紀錄全部同步至 Firestore。</w:t>
       </w:r>
     </w:p>
     <w:p>
@@ -577,7 +777,7 @@
         <w:pStyle w:val="ListBullet"/>
       </w:pPr>
       <w:r>
-        <w:t>表頭欄位：`["通報時間", "溫度閾值設定 (°C)", "通報環境溫度 (°C)", "氣象觀測時間", "警報狀態", "通知狀態"]`</w:t>
+        <w:t>`📏 重設欄寬為最佳預設`：自動重新排版歷史紀錄表格欄寬，保持極佳的視覺美觀。</w:t>
       </w:r>
     </w:p>
     <w:p>
@@ -585,17 +785,364 @@
         <w:pStyle w:val="Heading3"/>
       </w:pPr>
       <w:r>
-        <w:t>2. LINE 自動查詢 ID 功能 (LINE Bot 專屬)</w:t>
+        <w:t>2. 手動歷史補登工具</w:t>
       </w:r>
     </w:p>
     <w:p>
       <w:r>
-        <w:t>當有新群組或個人加入時，只需在 LINE 聊天室中傳送關鍵字：`id` 或 `查詢id`，LINE 機器人會透過 Webhook 自動將該對象的 `LINE_ID` 寫入試算表第一個分頁的最下方，管理人員可直接複製該 ID 填入 HMI 聯絡人管理介面中。</w:t>
+        <w:t>當 Firebase 重新建立，或者雲端同步出現故障時，管理員可以在本機執行以下指令：</w:t>
+      </w:r>
+    </w:p>
+    <w:p>
+      <w:pPr>
+        <w:spacing w:after="120"/>
+        <w:ind w:left="432"/>
+      </w:pPr>
+      <w:r>
+        <w:rPr>
+          <w:rFonts w:ascii="Consolas" w:hAnsi="Consolas"/>
+          <w:sz w:val="19"/>
+        </w:rPr>
+        <w:t>cd "C:\GOOGLE ANGET\溫度通報"</w:t>
+        <w:br/>
+        <w:t>python sync_sheet_to_firebase.py</w:t>
+        <w:br/>
+      </w:r>
+    </w:p>
+    <w:p>
+      <w:r>
+        <w:t>此工具會讀取試算表中的資料，批量格式化（統一 `obs_time`, `alert_state`, `status_text` 欄位），並寫入 Firebase Firestore，為 HMI 儀表板提供完整的歷史紀錄。</w:t>
+      </w:r>
+    </w:p>
+    <w:p>
+      <w:r>
+        <w:t>---</w:t>
+      </w:r>
+    </w:p>
+    <w:p>
+      <w:pPr>
+        <w:pStyle w:val="Heading2"/>
+      </w:pPr>
+      <w:r>
+        <w:t>🔒 安全注意事項</w:t>
+      </w:r>
+    </w:p>
+    <w:tbl>
+      <w:tblPr>
+        <w:tblStyle w:val="LightShading-Accent1"/>
+        <w:tblW w:type="auto" w:w="0"/>
+        <w:tblLook w:firstColumn="1" w:firstRow="1" w:lastColumn="0" w:lastRow="0" w:noHBand="0" w:noVBand="1" w:val="04A0"/>
+      </w:tblPr>
+      <w:tblGrid>
+        <w:gridCol w:w="3120"/>
+        <w:gridCol w:w="3120"/>
+        <w:gridCol w:w="3120"/>
+      </w:tblGrid>
+      <w:tr>
+        <w:tc>
+          <w:tcPr>
+            <w:tcW w:type="dxa" w:w="3120"/>
+          </w:tcPr>
+          <w:p>
+            <w:r>
+              <w:t>項目</w:t>
+            </w:r>
+          </w:p>
+        </w:tc>
+        <w:tc>
+          <w:tcPr>
+            <w:tcW w:type="dxa" w:w="3120"/>
+          </w:tcPr>
+          <w:p>
+            <w:r>
+              <w:t>安全危害程度</w:t>
+            </w:r>
+          </w:p>
+        </w:tc>
+        <w:tc>
+          <w:tcPr>
+            <w:tcW w:type="dxa" w:w="3120"/>
+          </w:tcPr>
+          <w:p>
+            <w:r>
+              <w:t>說明與指引</w:t>
+            </w:r>
+          </w:p>
+        </w:tc>
+      </w:tr>
+      <w:tr>
+        <w:tc>
+          <w:tcPr>
+            <w:tcW w:type="dxa" w:w="3120"/>
+          </w:tcPr>
+          <w:p>
+            <w:r>
+              <w:t>:---</w:t>
+            </w:r>
+          </w:p>
+        </w:tc>
+        <w:tc>
+          <w:tcPr>
+            <w:tcW w:type="dxa" w:w="3120"/>
+          </w:tcPr>
+          <w:p>
+            <w:r>
+              <w:t>:---</w:t>
+            </w:r>
+          </w:p>
+        </w:tc>
+        <w:tc>
+          <w:tcPr>
+            <w:tcW w:type="dxa" w:w="3120"/>
+          </w:tcPr>
+          <w:p>
+            <w:r>
+              <w:t>:---</w:t>
+            </w:r>
+          </w:p>
+        </w:tc>
+      </w:tr>
+      <w:tr>
+        <w:tc>
+          <w:tcPr>
+            <w:tcW w:type="dxa" w:w="3120"/>
+          </w:tcPr>
+          <w:p>
+            <w:r>
+              <w:t>`firebase_key.json`</w:t>
+            </w:r>
+          </w:p>
+        </w:tc>
+        <w:tc>
+          <w:tcPr>
+            <w:tcW w:type="dxa" w:w="3120"/>
+          </w:tcPr>
+          <w:p>
+            <w:r>
+              <w:t>🔴 **高危 (Secret Key)**</w:t>
+            </w:r>
+          </w:p>
+        </w:tc>
+        <w:tc>
+          <w:tcPr>
+            <w:tcW w:type="dxa" w:w="3120"/>
+          </w:tcPr>
+          <w:p>
+            <w:r>
+              <w:t>包含雲端資料庫完整控制私鑰，嚴禁傳送給他人或上傳至 Github 公開倉庫。</w:t>
+            </w:r>
+          </w:p>
+        </w:tc>
+      </w:tr>
+      <w:tr>
+        <w:tc>
+          <w:tcPr>
+            <w:tcW w:type="dxa" w:w="3120"/>
+          </w:tcPr>
+          <w:p>
+            <w:r>
+              <w:t>`config.json`</w:t>
+            </w:r>
+          </w:p>
+        </w:tc>
+        <w:tc>
+          <w:tcPr>
+            <w:tcW w:type="dxa" w:w="3120"/>
+          </w:tcPr>
+          <w:p>
+            <w:r>
+              <w:t>🟡 **中危 (API Key)**</w:t>
+            </w:r>
+          </w:p>
+        </w:tc>
+        <w:tc>
+          <w:tcPr>
+            <w:tcW w:type="dxa" w:w="3120"/>
+          </w:tcPr>
+          <w:p>
+            <w:r>
+              <w:t>包含 LINE Access Token、Gmail 應用程式密碼等敏感設定，請妥善保管。</w:t>
+            </w:r>
+          </w:p>
+        </w:tc>
+      </w:tr>
+      <w:tr>
+        <w:tc>
+          <w:tcPr>
+            <w:tcW w:type="dxa" w:w="3120"/>
+          </w:tcPr>
+          <w:p>
+            <w:r>
+              <w:t>HMI 管理密碼</w:t>
+            </w:r>
+          </w:p>
+        </w:tc>
+        <w:tc>
+          <w:tcPr>
+            <w:tcW w:type="dxa" w:w="3120"/>
+          </w:tcPr>
+          <w:p>
+            <w:r>
+              <w:t>🟡 **中危 (Password)**</w:t>
+            </w:r>
+          </w:p>
+        </w:tc>
+        <w:tc>
+          <w:tcPr>
+            <w:tcW w:type="dxa" w:w="3120"/>
+          </w:tcPr>
+          <w:p>
+            <w:r>
+              <w:t>預設為 `admin888`。請務必在系統上線後第一時間於 HMI 設定頁面變更為強密碼。</w:t>
+            </w:r>
+          </w:p>
+        </w:tc>
+      </w:tr>
+      <w:tr>
+        <w:tc>
+          <w:tcPr>
+            <w:tcW w:type="dxa" w:w="3120"/>
+          </w:tcPr>
+          <w:p>
+            <w:r>
+              <w:t>Firestore 規則</w:t>
+            </w:r>
+          </w:p>
+        </w:tc>
+        <w:tc>
+          <w:tcPr>
+            <w:tcW w:type="dxa" w:w="3120"/>
+          </w:tcPr>
+          <w:p>
+            <w:r>
+              <w:t>🟢 **低危 (Rules)**</w:t>
+            </w:r>
+          </w:p>
+        </w:tc>
+        <w:tc>
+          <w:tcPr>
+            <w:tcW w:type="dxa" w:w="3120"/>
+          </w:tcPr>
+          <w:p>
+            <w:r>
+              <w:t>如需精細控制權限，請於 Firebase Console 限制寫入權限僅限該 Service Account。</w:t>
+            </w:r>
+          </w:p>
+        </w:tc>
+      </w:tr>
+    </w:tbl>
+    <w:p/>
+    <w:p>
+      <w:r>
+        <w:t>---</w:t>
+      </w:r>
+    </w:p>
+    <w:p>
+      <w:pPr>
+        <w:pStyle w:val="Heading2"/>
+      </w:pPr>
+      <w:r>
+        <w:t>🆕 v4.5 版本更新摘要</w:t>
+      </w:r>
+    </w:p>
+    <w:p>
+      <w:r>
+        <w:t>相較於先前的舊版本，v4.5 整合版進行了如下優化：</w:t>
+      </w:r>
+    </w:p>
+    <w:p>
+      <w:pPr>
+        <w:pStyle w:val="ListNumber"/>
+      </w:pPr>
+      <w:r>
+        <w:t>**雙軌寫入整合**：本機端 `weather_monitor.py` 同時雙寫 GAS Web App 與 Firebase，完美融合兩者優勢。</w:t>
+      </w:r>
+    </w:p>
+    <w:p>
+      <w:pPr>
+        <w:pStyle w:val="ListNumber"/>
+      </w:pPr>
+      <w:r>
+        <w:t>**三段式心跳**：HMI 儀表板以 🟢在線、🟡雲端接管、🔴完全離線 清晰呈現系統健康狀態。</w:t>
+      </w:r>
+    </w:p>
+    <w:p>
+      <w:pPr>
+        <w:pStyle w:val="ListNumber"/>
+      </w:pPr>
+      <w:r>
+        <w:t>**手動同步加強**：`sync_sheet_to_firebase.py` 整合歷史紀錄 schema，確保資料統一。</w:t>
+      </w:r>
+    </w:p>
+    <w:p>
+      <w:pPr>
+        <w:pStyle w:val="ListNumber"/>
+      </w:pPr>
+      <w:r>
+        <w:t>**介面安全防護**：GAS 網頁端新增密碼驗證（預設 `admin888`）與登出機制，行動端版面全面適配。</w:t>
+      </w:r>
+    </w:p>
+    <w:p>
+      <w:pPr>
+        <w:pStyle w:val="ListNumber"/>
+      </w:pPr>
+      <w:r>
+        <w:t>**排程優化**：本機排程對齊至 `07:58` AM daily 開始，每 10 分鐘執行一次，排除 15 分鐘延遲，高頻精準監控。</w:t>
+      </w:r>
+    </w:p>
+    <w:p>
+      <w:r>
+        <w:t>---</w:t>
+      </w:r>
+    </w:p>
+    <w:p>
+      <w:pPr>
+        <w:pStyle w:val="Heading2"/>
+      </w:pPr>
+      <w:r>
+        <w:t>🆕 v4.7 版本更新摘要</w:t>
+      </w:r>
+    </w:p>
+    <w:p>
+      <w:r>
+        <w:t>相較於 v4.5 版本，v4.7 版本進行了如下重大優化：</w:t>
+      </w:r>
+    </w:p>
+    <w:p>
+      <w:pPr>
+        <w:pStyle w:val="ListNumber"/>
+      </w:pPr>
+      <w:r>
+        <w:t>**📊 雙模溫度趨勢圖**：不論是 Firebase HMI 還是 GAS 雲端後台，皆全面整合了 Chart.js 溫度趨勢圖。支援「即時 24H 監控」與「歷史區間範圍查詢」，並內建「等距降採樣 (Downsampling) 演算法」，即使查詢 1 至 2 個月的上千筆數據也能在手機上流暢縮放。</w:t>
+      </w:r>
+    </w:p>
+    <w:p>
+      <w:pPr>
+        <w:pStyle w:val="ListNumber"/>
+      </w:pPr>
+      <w:r>
+        <w:t>**⏰ 精準整點心跳排程 (`XX:58`)**：修正了 CWA 時段限制與本機排程節流設定。現在 Python 監控排程在 07:58 啟動，且在每天 `07:58`, `08:58`, `09:58`, ..., `23:58` 整點前的 58 分準時發送心跳，確保晚上 23:58 還能進行最後一次安全監控。</w:t>
+      </w:r>
+    </w:p>
+    <w:p>
+      <w:pPr>
+        <w:pStyle w:val="ListNumber"/>
+      </w:pPr>
+      <w:r>
+        <w:t>**🔄 試算表異動與刪除即時自動同步**：重構了 `Code.gs` 的同步邏輯為「雙向對齊機制」，當人員在試算表手動刪除或修改歷史數據時，Firebase 端會自動發送 `DELETE` 移除。此外，點選「套用設定並更新排程」後，系統會自動在雲端註冊「安裝式 onChange 監聽器」，當試算表有任何變更時，便會即時自動同步至 Firebase。</w:t>
+      </w:r>
+    </w:p>
+    <w:p>
+      <w:pPr>
+        <w:pStyle w:val="ListNumber"/>
+      </w:pPr>
+      <w:r>
+        <w:t>**🐞 HMI 功能相容性修正**：修正了 HMI 網頁端的 `chartMode` 重複宣告語法錯誤，並針對 CSS 與 JS 檔案載入加入了快取清理機制（Cache-busting `v=4.6`），徹底解決「歷史查詢」按鈕無反應的問題。</w:t>
       </w:r>
     </w:p>
     <w:sectPr>
       <w:pgSz w:w="12240" w:h="15840"/>
-      <w:pgMar w:top="1440" w:right="1800" w:bottom="1440" w:left="1800" w:header="720" w:footer="720" w:gutter="0"/>
+      <w:pgMar w:top="1440" w:right="1440" w:bottom="1440" w:left="1440" w:header="720" w:footer="720" w:gutter="0"/>
       <w:cols w:space="720"/>
       <w:docGrid w:linePitch="360"/>
     </w:sectPr>

</xml_diff>

<commit_message>
docs: update manual formats (DOCX, PDF, PPTX, MD) to v4.8 to include MS Teams notification guides
</commit_message>
<xml_diff>
--- a/溫度通報/溫度通報系統操作說明.docx
+++ b/溫度通報/溫度通報系統操作說明.docx
@@ -7,7 +7,7 @@
         <w:pStyle w:val="Heading1"/>
       </w:pPr>
       <w:r>
-        <w:t>彰化縣線西鄉環境溫度監控與雙軌備援通報系統 — 操作與維護說明書 (v4.7)</w:t>
+        <w:t>彰化縣線西鄉環境溫度監控與雙軌備援通報系統 — 操作與維護說明書 (v4.8)</w:t>
       </w:r>
     </w:p>
     <w:p>
@@ -17,7 +17,7 @@
     </w:p>
     <w:p>
       <w:r>
-        <w:t>系統實現 24 小時不間斷的天氣觀測與雙向狀態同步，當溫度高於設定閾值時將透過 LINE 及 Email 發送通知，提供工業級的高可用性與簡便的行動化管理。</w:t>
+        <w:t>系統實現 24 小時不間斷的天氣觀測與雙向狀態同步，當溫度高於設定閾值時將透過 LINE、Email 及 Microsoft Teams 頻道發送通知，提供工業級的高可用性與簡便的行動化管理。</w:t>
       </w:r>
     </w:p>
     <w:p>
@@ -425,6 +425,14 @@
         <w:br/>
         <w:t xml:space="preserve">    "from_email": "您的發信信箱@gmail.com"</w:t>
         <w:br/>
+        <w:t xml:space="preserve">  },</w:t>
+        <w:br/>
+        <w:t xml:space="preserve">  "teams": {</w:t>
+        <w:br/>
+        <w:t xml:space="preserve">    "enabled": true,</w:t>
+        <w:br/>
+        <w:t xml:space="preserve">    "webhook_url": "您的 Microsoft Teams Webhook 連結"</w:t>
+        <w:br/>
         <w:t xml:space="preserve">  }</w:t>
         <w:br/>
         <w:t>}</w:t>
@@ -462,6 +470,17 @@
           <w:i/>
         </w:rPr>
         <w:t>- `firebase_key.json`：本機程式亦會讀取同目錄下的 Service Account 私鑰，將心跳直接 Patch 寫入 Firebase Firestore，無須中轉，提供極速更新。</w:t>
+      </w:r>
+    </w:p>
+    <w:p>
+      <w:pPr>
+        <w:ind w:left="288"/>
+      </w:pPr>
+      <w:r>
+        <w:rPr>
+          <w:i/>
+        </w:rPr>
+        <w:t>- `teams`：填入 Teams 頻道的 Webhook URL（由 Power Automate 工作流程產生），啟用後會自動將警報傳送至 Teams 頻道。</w:t>
       </w:r>
     </w:p>
     <w:p>
@@ -630,6 +649,38 @@
       </w:r>
     </w:p>
     <w:p>
+      <w:pPr>
+        <w:pStyle w:val="Heading3"/>
+      </w:pPr>
+      <w:r>
+        <w:t>4. 設定 Microsoft Teams Webhook 通報</w:t>
+      </w:r>
+    </w:p>
+    <w:p>
+      <w:pPr>
+        <w:pStyle w:val="ListNumber"/>
+      </w:pPr>
+      <w:r>
+        <w:t>在 Microsoft Teams 欲接收通知的頻道點選 **`...` (更多選項)** -&gt; **「工作流程」(Workflows)**。</w:t>
+      </w:r>
+    </w:p>
+    <w:p>
+      <w:pPr>
+        <w:pStyle w:val="ListNumber"/>
+      </w:pPr>
+      <w:r>
+        <w:t>搜尋並選取 **「在收到 Webhook 要求時張貼至頻道」** 範本，按步驟建立後，複製生成的 **Webhook URL**。</w:t>
+      </w:r>
+    </w:p>
+    <w:p>
+      <w:pPr>
+        <w:pStyle w:val="ListNumber"/>
+      </w:pPr>
+      <w:r>
+        <w:t>將該 URL 貼入本機 `config.json` 的 `"teams" -&gt; "webhook_url"` 欄位中。</w:t>
+      </w:r>
+    </w:p>
+    <w:p>
       <w:r>
         <w:t>---</w:t>
       </w:r>
@@ -648,6 +699,38 @@
       </w:pPr>
       <w:r>
         <w:t>**更新 Code**：開啟 Google 試算表 → 擴充功能 → Apps Script。開啟 `Code.gs` 全選清除，並將最新代碼貼上，按 Ctrl+S 存檔。</w:t>
+      </w:r>
+    </w:p>
+    <w:p>
+      <w:pPr>
+        <w:pStyle w:val="ListNumber"/>
+      </w:pPr>
+      <w:r>
+        <w:t>**設定雲端 Teams Webhook**：在試算表的 **「系統設定」** 工作表分頁中，手動新增一列：</w:t>
+      </w:r>
+    </w:p>
+    <w:p>
+      <w:pPr>
+        <w:pStyle w:val="ListBullet"/>
+      </w:pPr>
+      <w:r>
+        <w:t>**設定項目**：`Teams Webhook URL`</w:t>
+      </w:r>
+    </w:p>
+    <w:p>
+      <w:pPr>
+        <w:pStyle w:val="ListBullet"/>
+      </w:pPr>
+      <w:r>
+        <w:t>**設定值**：貼上你剛複製的 Teams Webhook 網址</w:t>
+      </w:r>
+    </w:p>
+    <w:p>
+      <w:pPr>
+        <w:pStyle w:val="ListBullet"/>
+      </w:pPr>
+      <w:r>
+        <w:t>**說明**：`傳送高溫警報與溫度回落通知的 MS Teams Webhook 連結 (選填)`</w:t>
       </w:r>
     </w:p>
     <w:p>
@@ -1140,6 +1223,40 @@
         <w:t>**🐞 HMI 功能相容性修正**：修正了 HMI 網頁端的 `chartMode` 重複宣告語法錯誤，並針對 CSS 與 JS 檔案載入加入了快取清理機制（Cache-busting `v=4.6`），徹底解決「歷史查詢」按鈕無反應的問題。</w:t>
       </w:r>
     </w:p>
+    <w:p>
+      <w:r>
+        <w:t>---</w:t>
+      </w:r>
+    </w:p>
+    <w:p>
+      <w:pPr>
+        <w:pStyle w:val="Heading2"/>
+      </w:pPr>
+      <w:r>
+        <w:t>🆕 v4.8 版本更新摘要</w:t>
+      </w:r>
+    </w:p>
+    <w:p>
+      <w:r>
+        <w:t>相較於 v4.7 版本，v4.8 版本進行了如下優化：</w:t>
+      </w:r>
+    </w:p>
+    <w:p>
+      <w:pPr>
+        <w:pStyle w:val="ListNumber"/>
+      </w:pPr>
+      <w:r>
+        <w:t>**💬 新增 Microsoft Teams Webhook 通報**：本機端及雲端備援腳本均全面支援 MS Teams Webhook 管道，當高溫超標或溫度回落時會自動發送 MessageCard 警報至 Teams 頻道。</w:t>
+      </w:r>
+    </w:p>
+    <w:p>
+      <w:pPr>
+        <w:pStyle w:val="ListNumber"/>
+      </w:pPr>
+      <w:r>
+        <w:t>**⚙️ 試算表設定檔動態載入**：雲端 GAS 支援從「系統設定」分頁動態讀取 `Teams Webhook URL` 列，方便管理者於試算表介面中直接設定與修改。</w:t>
+      </w:r>
+    </w:p>
     <w:sectPr>
       <w:pgSz w:w="12240" w:h="15840"/>
       <w:pgMar w:top="1440" w:right="1440" w:bottom="1440" w:left="1440" w:header="720" w:footer="720" w:gutter="0"/>

</xml_diff>

<commit_message>
feat: support monthly 24-hour temperature records tab on Google Sheet and update manuals to v4.9
</commit_message>
<xml_diff>
--- a/溫度通報/溫度通報系統操作說明.docx
+++ b/溫度通報/溫度通報系統操作說明.docx
@@ -7,7 +7,7 @@
         <w:pStyle w:val="Heading1"/>
       </w:pPr>
       <w:r>
-        <w:t>彰化縣線西鄉環境溫度監控與雙軌備援通報系統 — 操作與維護說明書 (v4.8)</w:t>
+        <w:t>彰化縣線西鄉環境溫度監控與雙軌備援通報系統 — 操作與維護說明書 (v4.9)</w:t>
       </w:r>
     </w:p>
     <w:p>
@@ -1257,6 +1257,40 @@
         <w:t>**⚙️ 試算表設定檔動態載入**：雲端 GAS 支援從「系統設定」分頁動態讀取 `Teams Webhook URL` 列，方便管理者於試算表介面中直接設定與修改。</w:t>
       </w:r>
     </w:p>
+    <w:p>
+      <w:r>
+        <w:t>---</w:t>
+      </w:r>
+    </w:p>
+    <w:p>
+      <w:pPr>
+        <w:pStyle w:val="Heading2"/>
+      </w:pPr>
+      <w:r>
+        <w:t>🆕 v4.9 版本更新摘要</w:t>
+      </w:r>
+    </w:p>
+    <w:p>
+      <w:r>
+        <w:t>相較於 v4.8 版本，v4.9 版本進行了如下重大優化：</w:t>
+      </w:r>
+    </w:p>
+    <w:p>
+      <w:pPr>
+        <w:pStyle w:val="ListNumber"/>
+      </w:pPr>
+      <w:r>
+        <w:t>**📊 獨立的月度 24 小時記錄分頁**：雲端 Apps Script 重構了日誌寫入路由。現在每 10 分鐘一次的日常例行心跳與溫度觀測，將被分流寫入專屬的月度分頁（例如：`六月-24小時記錄`），避免主要的「通報紀錄分頁」（如 `紀錄_2026-06`）被洗版，使通報紀錄僅保留真正的警報事件，版面更乾淨。</w:t>
+      </w:r>
+    </w:p>
+    <w:p>
+      <w:pPr>
+        <w:pStyle w:val="ListNumber"/>
+      </w:pPr>
+      <w:r>
+        <w:t>**🎨 專屬綠色系排版風格**：針對「24小時記錄分頁」套用專屬的深綠色主題表頭（`#2E7D32`）與排版格式，利於視覺區分。</w:t>
+      </w:r>
+    </w:p>
     <w:sectPr>
       <w:pgSz w:w="12240" w:h="15840"/>
       <w:pgMar w:top="1440" w:right="1440" w:bottom="1440" w:left="1440" w:header="720" w:footer="720" w:gutter="0"/>

</xml_diff>

<commit_message>
fix: rename 24-hour log sheetName to 24小時紀錄_YYYY-MM format and remove sheet.getName prefix in notifications
</commit_message>
<xml_diff>
--- a/溫度通報/溫度通報系統操作說明.docx
+++ b/溫度通報/溫度通報系統操作說明.docx
@@ -1280,7 +1280,7 @@
         <w:pStyle w:val="ListNumber"/>
       </w:pPr>
       <w:r>
-        <w:t>**📊 獨立的月度 24 小時記錄分頁**：雲端 Apps Script 重構了日誌寫入路由。現在每 10 分鐘一次的日常例行心跳與溫度觀測，將被分流寫入專屬的包含年份的月度分頁（例如：`2026年六月-24小時記錄`），防範跨年度的名稱衝突與資料重疊，避免主要的「通報紀錄分頁」（如 `紀錄_2026-06`）被洗版，使通報紀錄僅保留真正的警報事件，版面更乾淨。</w:t>
+        <w:t>**📊 獨立的月度 24 小時記錄分頁**：雲端 Apps Script 重構了日誌寫入路由。現在每 10 分鐘一次的日常例行心跳與溫度觀測，將被分流寫入專屬的西元月度分頁（例如：`24小時紀錄_2026-06`），完美防範跨年度的名稱衝突，並避免主要的「通報紀錄分頁」（如 `紀錄_2026-06`）被洗版，使通報紀錄僅保留真正的警報事件，版面更乾淨。</w:t>
       </w:r>
     </w:p>
     <w:p>
@@ -1289,6 +1289,14 @@
       </w:pPr>
       <w:r>
         <w:t>**🎨 專屬綠色系排版風格**：針對「24小時記錄分頁」套用專屬的深綠色主題表頭（`#2E7D32`）與排版格式，利於視覺區分。</w:t>
+      </w:r>
+    </w:p>
+    <w:p>
+      <w:pPr>
+        <w:pStyle w:val="ListNumber"/>
+      </w:pPr>
+      <w:r>
+        <w:t>**💬 警報訊息格式美化**：移除了警報簡訊內文前的試算表分頁名稱字串（`sheet.getName()`），使 LINE/Email 警報標題更直接簡潔（如：`【環境高溫警報】` 或 `【環境溫度回落通知】`）。</w:t>
       </w:r>
     </w:p>
     <w:sectPr>

</xml_diff>